<commit_message>
Add hypoid gear support to ISO 10300 calculator
Generalizes the virtual-cylindrical-gear geometry, KHalpha/KFalpha
offset blend, and adds the hypoid factor ZHyp, extending prior
non-offset-only scope to full hypoid gears (a != 0). Validated
end-to-end against ISO/TR 10300-30 Sample 2 (hypoid, a=15mm):
60/60 self-test checks pass alongside the existing Sample 1 (71/71).

Fixed a degree/radian double-conversion bug in the new general
auxiliary angle gamma, found via the Sample 2 validation. Documented
one confirmed-external issue (an apparent unit slip in Sample 2's own
K*Halpha table cell, inconsequential to its published result) and one
unresolved implementation gap (the contact-line clipping factor Clb
overestimates tip/root line lengths for hypoid geometries with a
pronounced fmaxB/fmax0 split, biasing ZLS ~10% high for Sample 2) -
both flagged clearly in code, the self-test, and the findings docx
rather than glossed over.

Co-Authored-By: Claude Sonnet 5 <noreply@anthropic.com>
</commit_message>
<xml_diff>
--- a/ISO10300Calc/ISO10300_Implementation_Findings.docx
+++ b/ISO10300Calc/ISO10300_Implementation_Findings.docx
@@ -57,7 +57,7 @@
         <w:spacing w:after="160"/>
       </w:pPr>
       <w:r>
-        <w:t xml:space="preserve">ISO10300Calc is a new WinForms calculator implementing ISO 10300:2023 parts 1-3 (Introduction and general influence factors; Calculation of surface durability (macropitting); Calculation of tooth root strength), added to the same Visual Studio solution (AGMAStandards.sln) as the existing AGMA2003D19Calc and AGMA929B22Calc projects. It follows the identical architecture and UI pattern established by those projects: a PropertyGrid-bound input model organized into numbered categories, a calculation engine that logs every intermediate value with its equation number into an audit-trail report, a --selftest command-line mode that checks the engine against a published worked example, and a Load Example / Calculate / Save Report workflow.</w:t>
+        <w:t xml:space="preserve">ISO10300Calc is a new WinForms calculator implementing ISO 10300:2023 parts 1-3 (Introduction and general influence factors; Calculation of surface durability (macropitting); Calculation of tooth root strength), added to the same Visual Studio solution (AGMAStandards.sln) as the existing AGMA2003D19Calc and AGMA929B22Calc projects. It follows the identical architecture and UI pattern established by those projects: a PropertyGrid-bound input model organized into numbered categories, a calculation engine that logs every intermediate value with its equation number into an audit-trail report, a --selftest command-line mode that checks the engine against published worked examples, and a Load Example / Calculate / Save Report workflow.</w:t>
       </w:r>
     </w:p>
     <w:p>
@@ -65,7 +65,7 @@
         <w:spacing w:after="160"/>
       </w:pPr>
       <w:r>
-        <w:t xml:space="preserve">The calculator implements Method B1 throughout — the ISO-native rating method based on virtual cylindrical gears, distinct from Method B2 (see Section 2). It covers: Part 1's general load factors (application factor, dynamic factor, face load factor, transverse load factors); the full virtual-cylindrical-gear geometry of Part 1 Annex A; Part 2's complete contact-stress (macropitting) formula chain; and Part 3's complete tooth-root bending-stress formula chain, including the tooth-form-factor derivation from first principles (cutter geometry through to YFa and YSa) rather than a chart lookup.</w:t>
+        <w:t xml:space="preserve">The calculator implements Method B1 throughout — the ISO-native rating method based on virtual cylindrical gears, distinct from Method B2 (see Section 2). It covers: Part 1's general load factors (application factor, dynamic factor, face load factor, transverse load factors); the full virtual-cylindrical-gear geometry of Part 1 Annex A, for both bevel gears without offset and hypoid gears; Part 2's complete contact-stress (macropitting) formula chain, including the hypoid factor ZHyp; and Part 3's complete tooth-root bending-stress formula chain, including the tooth-form-factor derivation from first principles (cutter geometry through to YFa and YSa) rather than a chart lookup.</w:t>
       </w:r>
     </w:p>
     <w:p>
@@ -91,7 +91,7 @@
         <w:spacing w:after="120" w:before="240"/>
       </w:pPr>
       <w:r>
-        <w:t xml:space="preserve">2.1 Restriction to non-offset bevel gears (a = 0)</w:t>
+        <w:t xml:space="preserve">2.1 Scope: both non-offset bevel gears and hypoid gears, drive flank only</w:t>
       </w:r>
     </w:p>
     <w:p>
@@ -99,7 +99,7 @@
         <w:spacing w:after="160"/>
       </w:pPr>
       <w:r>
-        <w:t xml:space="preserve">ISO 10300 (all parts) covers hypoid gears (nonzero offset a) as well as bevel gears without offset. The general virtual-cylindrical-gear geometry of Part 1 Annex A, and the associated Z/Y-factor formulas of Parts 2 and 3, are written for the general hypoid case and specialize considerably when a = 0. This calculator implements only the a = 0 (non-offset, shaft angle Sigma = 90 deg) case — the same restriction AGMA2003D19Calc already applies to ANSI/AGMA 2003-D19, which likewise excludes hypoid gears. This keeps the two calculators' scope aligned for the eventual comparison and avoids a very substantial amount of additional hypoid-specific geometry (offset angles, mean-point construction, drive/coast-side asymmetry) that a full implementation would require.</w:t>
+        <w:t xml:space="preserve">ISO 10300 (all parts) covers hypoid gears (nonzero offset a) as well as bevel gears without offset (a = 0). This calculator initially implemented only the a = 0 case, matching AGMA2003D19Calc's own restriction to non-offset bevel gears, but was subsequently extended to the general hypoid case once validated against a second published worked example (ISO/TR 10300-30 Sample 2, a hypoid gear pair - see Section 6.2). The general virtual-cylindrical-gear geometry of Part 1 Annex A - nonzero offset angles (zeta_mp, zeta_m, zeta_R), the auxiliary angle gamma for the facewidth and contact-line calculations, the offset-angle term in the radius of relative curvature (Eq A.39), and the general blend of KHalpha/KFalpha towards 1.0 as the relative offset grows (Eq 40/41) - is now implemented in full, along with the hypoid factor ZHyp (ISO 10300-2, 6.5.3, sliding-velocity formulas).</w:t>
       </w:r>
     </w:p>
     <w:p>
@@ -107,15 +107,7 @@
         <w:spacing w:after="160"/>
       </w:pPr>
       <w:r>
-        <w:t xml:space="preserve">A further consequence of a = 0 used throughout the geometry engine: the virtual cylindrical gear's effective facewidth bv,eff equals 0.85*b2 directly and its facewidth bv equals the real facewidth b exactly (ISO 10300-1 Annex A, A.2.4) — both of these are non-trivial simplifications of the general hypoid formulas (A.19/A.22) that were confirmed against the published example (Section 6) before being relied on.</w:t>
-      </w:r>
-    </w:p>
-    <w:p>
-      <w:pPr>
-        <w:spacing w:after="160"/>
-      </w:pPr>
-      <w:r>
-        <w:t xml:space="preserve">Only the loaded (drive) flank is rated, matching the scope of ISO/TR 10300-30's own Sample 1 worked example, which likewise only carries the calculation through for the drive flank. A warning is raised if the drive- and coast-side pressure angles supplied differ, since the coast flank is not separately evaluated.</w:t>
+        <w:t xml:space="preserve">Only the loaded (drive) flank is rated, matching the scope of both ISO/TR 10300-30 Sample 1 and Sample 2, which likewise only carry the calculation through for the drive flank. A warning is raised if the drive- and coast-side pressure angles supplied differ, since the coast flank is not separately evaluated.</w:t>
       </w:r>
     </w:p>
     <w:p>
@@ -157,7 +149,7 @@
         <w:spacing w:after="160"/>
       </w:pPr>
       <w:r>
-        <w:t xml:space="preserve">Two of ISO 10300-1 Annex A's formulas, as typeset in the published standard (and reproduced identically in ISO/TR 10300-30), did not reproduce the technical report's own published numeric results on first implementation. Both were tracked down by reconciling every intermediate value against ISO/TR 10300-30 Sample 1 (see Section 6) and are documented here since they are easy to mis-transcribe from the printed layout.</w:t>
+        <w:t xml:space="preserve">Several of ISO 10300-1 Annex A's formulas, as typeset in the published standard (and reproduced identically in ISO/TR 10300-30), did not reproduce the technical report's own published numeric results on first implementation. Each was tracked down by reconciling every intermediate value against ISO/TR 10300-30 Sample 1 and Sample 2 (see Section 6) and is documented here since these are easy to mis-transcribe from the printed layout.</w:t>
       </w:r>
     </w:p>
     <w:p>
@@ -267,6 +259,73 @@
       </w:pPr>
       <w:r>
         <w:t xml:space="preserve">ISO 10300-2:2023's Formula (3), Fn = Fmt1/(cos(alpha_e)*cos(beta_m1)), is flagged by ISO/TR 10300-30 (Sample 1, Table A.7 note) as containing a misprint; the corrected form uses the *generated* pressure angle alpha_n (alpha_nD or alpha_nC) in place of the *effective* pressure angle alpha_e. This calculator uses alpha_nD throughout, matching the technical report's own correction.</w:t>
+      </w:r>
+    </w:p>
+    <w:p>
+      <w:pPr>
+        <w:pStyle w:val="Heading3"/>
+        <w:spacing w:after="100" w:before="200"/>
+      </w:pPr>
+      <w:r>
+        <w:t xml:space="preserve">3.4 Degree/radian double-conversion in the general (hypoid) auxiliary angle gamma</w:t>
+      </w:r>
+    </w:p>
+    <w:p>
+      <w:pPr>
+        <w:spacing w:after="160"/>
+      </w:pPr>
+      <w:r>
+        <w:t xml:space="preserve">When the a = 0 restriction was lifted (Section 6.2), the auxiliary angle gamma (Formula A.35, tan(gamma) = tan(gamma')/cos(alpha_vet)) needed to be computed for the first time (it is identically zero for a = 0, so this code path was never exercised until Sample 2). The implementation mixed this project's degree-based trig helpers (which internally convert degrees to radians) with an explicit radian conversion already applied beforehand, effectively converting alpha_vet from degrees to radians twice. Because a very small angle in radians is numerically close to its own degree value near zero, this bug was not obvious from casual inspection, but produced a visibly wrong gamma (4.18 deg instead of 4.69 deg for Sample 2) that cascaded into the maximum-contact-line-distance calculation (fmax) and the middle contact line length (lbm, off by 0.95%). Fixed by using the raw (radian-based) Math.Cos consistently in that one expression.</w:t>
+      </w:r>
+    </w:p>
+    <w:p>
+      <w:pPr>
+        <w:pStyle w:val="Heading3"/>
+        <w:spacing w:after="100" w:before="200"/>
+      </w:pPr>
+      <w:r>
+        <w:t xml:space="preserve">3.5 KHalpha* (Method B, before offset blending) does not reproduce Sample 2 - apparent unit slip in the source table, not this implementation</w:t>
+      </w:r>
+    </w:p>
+    <w:p>
+      <w:pPr>
+        <w:spacing w:after="160"/>
+      </w:pPr>
+      <w:r>
+        <w:t xml:space="preserve">With the corrected additive form from Section 3.2, Sample 1's KHalpha* (a = 0) matches the published value to 0.03%. Sample 2's KHalpha* (Method B, eps_vgamma = 3.106 &gt; 2), computed the identical way with Sample 2's own published inputs (FmtH = 18925.8 N, bv = 29.271 mm, fpt = 23.5 um), gives 1.213 against a published 0.900. Re-deriving what input would be needed to reproduce 0.900 exactly pointed to a specific, verifiable cause: dividing (fpt - y_alpha) by 1000 before use - i.e. treating micrometres as millimetres - gives 0.9003, matching the published "0,900" to four significant figures.</w:t>
+      </w:r>
+    </w:p>
+    <w:p>
+      <w:pPr>
+        <w:spacing w:after="160"/>
+      </w:pPr>
+      <w:r>
+        <w:t xml:space="preserve">Since fpt and y_alpha are unambiguously defined in micrometres throughout ISO 10300-1 (confirmed by Sample 1's own identical formula, which only matches using micrometres), this points to a unit slip in ISO/TR 10300-30's own Sample 2 table for this one cell, rather than a gap in this implementation - the same kind of transcription error the technical report itself acknowledges elsewhere (Section 3.3). It is a plausible oversight to have survived review: Formula 40 blends KHalpha* towards 1.0 as the relative hypoid offset a_rel grows from 0 to 0.1, treating a_rel &gt;= 0.1 as fully replaced by 1.0. Because Sample 2's a_rel = 0.211 exceeds that window, KHalpha = KHalpha* - (KHalpha*-1)/0.1 * 0.1 collapses to exactly 1.0 regardless of KHalpha*'s value - a mathematical identity - so an error in this one intermediate cell has zero effect on the published final result and would not have been caught by checking the sample's own downstream figures. This implementation's KHalpha* is used as computed (in micrometres); the published final KHalpha = 1.000 is reproduced exactly.</w:t>
+      </w:r>
+    </w:p>
+    <w:p>
+      <w:pPr>
+        <w:pStyle w:val="Heading3"/>
+        <w:spacing w:after="100" w:before="200"/>
+      </w:pPr>
+      <w:r>
+        <w:t xml:space="preserve">3.6 Known-unresolved: contact-line clipping factor Clb for hypoid tip/root lines</w:t>
+      </w:r>
+    </w:p>
+    <w:p>
+      <w:pPr>
+        <w:spacing w:after="160"/>
+      </w:pPr>
+      <w:r>
+        <w:t xml:space="preserve">The corrected Clb form from Section 3.1 reproduces every contact-line length checked in both samples to within 0.2% - except the tip and root contact lines (f = ft, f = fr) of Sample 2's hypoid geometry, where it overestimates the length by roughly 35%, giving a load sharing factor ZLS about 10% higher than published (0.776 vs. 0.703) and a correspondingly high bias in the pitting contact stress and bending stress that depend on it (sigmaH0, sigmaH, YLS, sigmaF, roughly 10-24% high for Sample 2 only). The middle contact line (f = 0, needed for sigmaH0/sigmaH's own Zm-B/rho_rel terms and used directly by ZM-B) is unaffected and matches exactly.</w:t>
+      </w:r>
+    </w:p>
+    <w:p>
+      <w:pPr>
+        <w:spacing w:after="160"/>
+      </w:pPr>
+      <w:r>
+        <w:t xml:space="preserve">Several alternative forms of Formula A.36 were tried against both samples' tip-line data (reverse-solved from their own published related-area values) without finding one that fits both simultaneously; the geometry-dependent asymmetry between Sample 1 (fmaxB and fmax0 nearly equal in magnitude) and Sample 2 (fmaxB = 12.87 mm vs. fmax0 = -5.00 mm, a much larger split) suggests the true general form accounts for this asymmetry in a way not evident from the printed formula. This is left as a known, clearly-flagged limitation rather than a guessed fix: the calculator raises an on-screen warning whenever a hypoid design's fmaxB/fmax0 split is similarly pronounced, and the self-test documents the gap explicitly instead of loosening its tolerances to hide it.</w:t>
       </w:r>
     </w:p>
     <w:p>
@@ -765,7 +824,7 @@
                 <w:sz w:val="20"/>
                 <w:szCs w:val="20"/>
               </w:rPr>
-              <w:t xml:space="preserve">a = 0 throughout, so KHalpha = KFalpha exactly (Eq 40/41 collapse)</w:t>
+              <w:t xml:space="preserve">General offset blend (Eq 40/41) towards 1.0 as a_rel grows; KHalpha = KFalpha always</w:t>
             </w:r>
           </w:p>
         </w:tc>
@@ -833,7 +892,7 @@
                 <w:sz w:val="20"/>
                 <w:szCs w:val="20"/>
               </w:rPr>
-              <w:t xml:space="preserve">Eq A.1-A.46 (a = 0 subset)</w:t>
+              <w:t xml:space="preserve">Eq A.1-A.46, general (any offset)</w:t>
             </w:r>
           </w:p>
         </w:tc>
@@ -2323,7 +2382,7 @@
         <w:spacing w:after="160"/>
       </w:pPr>
       <w:r>
-        <w:t xml:space="preserve">ISO 10300-1 Annex A ("Calculation of virtual cylindrical gears - Method B1") is the ISO analogue of AGMA's own Annex C(M): it converts the actual bevel gear tooth geometry into an equivalent cylindrical gear pair from which every Z- and Y-factor is then computed. For the a = 0 case implemented here, this covers: reference/tip/root/base diameters and helix angle of the virtual gears (A.2.2-A.2.3); facewidth (A.2.4, trivial for a = 0); transverse and face contact ratios (A.2.6); the length of the tip/middle/root contact lines via the elliptical correction factor Clb (A.2.7, see Section 3.1 for the correction applied); the radius of relative curvature at the mean point (A.2.8); and the virtual gear data in normal section (A.3), which feeds directly into Part 3's tooth-form-factor derivation.</w:t>
+        <w:t xml:space="preserve">ISO 10300-1 Annex A ("Calculation of virtual cylindrical gears - Method B1") is the ISO analogue of AGMA's own Annex C(M): it converts the actual bevel or hypoid gear tooth geometry into an equivalent cylindrical gear pair from which every Z- and Y-factor is then computed. This calculator implements the general form throughout: reference diameters via dv = dm/cos(delta) (Eq A.1, rather than the a=0-only shortcut of Eq A.3/A.4) and virtual tooth counts via zv = dv/mvt (rather than Eq A.14/A.15's a=0-only shortcut); tip/root/base diameters and helix angle of the virtual gears (A.2.2-A.2.3); facewidth including the offset-angle terms (A.2.4, Eq A.19-A.22, auxiliary angles theta_mp and gamma'); transverse and face contact ratios (A.2.6); the length of the tip/middle/root contact lines via the elliptical correction factor Clb and the general auxiliary angle gamma (A.2.7, see Sections 3.1/3.4/3.6 for the corrections applied and the one unresolved gap); the radius of relative curvature at the mean point including the offset-angle term (A.2.8, Eq A.39); and the virtual gear data in normal section (A.3), which feeds directly into Part 3's tooth-form-factor derivation. For a = 0, every general formula above algebraically reduces to the non-offset special case (confirmed numerically: Sample 1's results are unchanged from before the hypoid generalization was added).</w:t>
       </w:r>
     </w:p>
     <w:p>
@@ -2340,7 +2399,16 @@
         <w:spacing w:after="150" w:before="300"/>
       </w:pPr>
       <w:r>
-        <w:t xml:space="preserve">6. Validation: ISO/TR 10300-30:2024 Sample 1</w:t>
+        <w:t xml:space="preserve">6. Validation: ISO/TR 10300-30:2024</w:t>
+      </w:r>
+    </w:p>
+    <w:p>
+      <w:pPr>
+        <w:pStyle w:val="Heading2"/>
+        <w:spacing w:after="120" w:before="240"/>
+      </w:pPr>
+      <w:r>
+        <w:t xml:space="preserve">6.1 Sample 1 (spiral bevel, no offset)</w:t>
       </w:r>
     </w:p>
     <w:p>
@@ -2364,11 +2432,11 @@
     </w:p>
     <w:p>
       <w:pPr>
-        <w:pStyle w:val="Heading2"/>
-        <w:spacing w:after="120" w:before="240"/>
-      </w:pPr>
-      <w:r>
-        <w:t xml:space="preserve">6.1 Results</w:t>
+        <w:pStyle w:val="Heading3"/>
+        <w:spacing w:after="100" w:before="200"/>
+      </w:pPr>
+      <w:r>
+        <w:t xml:space="preserve">6.1.1 Results</w:t>
       </w:r>
     </w:p>
     <w:tbl>
@@ -3847,11 +3915,28 @@
     </w:p>
     <w:p>
       <w:pPr>
+        <w:pStyle w:val="Heading3"/>
+        <w:spacing w:after="100" w:before="200"/>
+      </w:pPr>
+      <w:r>
+        <w:t xml:space="preserve">6.1.2 A genuine standard inconsistency found during validation (not a bug)</w:t>
+      </w:r>
+    </w:p>
+    <w:p>
+      <w:pPr>
+        <w:spacing w:after="160"/>
+      </w:pPr>
+      <w:r>
+        <w:t xml:space="preserve">Two published values — the permissible contact stress sigmaHP1-B1 (1617.8 N/mm^2) and the resulting safety factor SH1-B1 (0.944) — are deliberately excluded from the automated checks. ISO/TR 10300-30 Sample 1 states its life factors as "ZNT = 1.0" and "YNT = 1.0" directly, without deriving either from a stated number of load cycles (the operating-conditions table, A.4, gives no life requirement). Investigating why revealed that ISO 10300-2's Table 6 reference point for ZNT = 1.0 (roughly 5*10^7 to 10^9 cycles, depending on the material-family row) and ISO 10300-3's Table 5 reference point for YNT = 1.0 (3*10^6 cycles, stated explicitly in the standard's own text) are genuinely different cycle counts — the two life-factor curves do not share a common "reference life". At the NL = 3*10^6 used throughout this self-test (chosen to match YNT exactly), this calculator's ZNT curve correctly returns about 1.43, not 1.0, so the permissible-stress and safety-factor figures that multiply by ZNT diverge from the example by construction. Every quantity upstream of this multiplication (sigmaH0, sigmaH, and all the pitting Z-factors) matches to within a few tenths of a percent, confirming the calculated-stress side of the pipeline is correct and the divergence is confined to this one life-reference mismatch. The same reasoning, and the same exclusion, applies to Sample 2 below.</w:t>
+      </w:r>
+    </w:p>
+    <w:p>
+      <w:pPr>
         <w:pStyle w:val="Heading2"/>
         <w:spacing w:after="120" w:before="240"/>
       </w:pPr>
       <w:r>
-        <w:t xml:space="preserve">6.2 A genuine standard inconsistency found during validation (not a bug)</w:t>
+        <w:t xml:space="preserve">6.2 Sample 2 (hypoid gear, offset a = 15 mm)</w:t>
       </w:r>
     </w:p>
     <w:p>
@@ -3859,7 +3944,941 @@
         <w:spacing w:after="160"/>
       </w:pPr>
       <w:r>
-        <w:t xml:space="preserve">Two published values — the permissible contact stress sigmaHP1-B1 (1617.8 N/mm^2) and the resulting safety factor SH1-B1 (0.944) — are deliberately excluded from the automated checks. ISO/TR 10300-30 Sample 1 states its life factors as "ZNT = 1.0" and "YNT = 1.0" directly, without deriving either from a stated number of load cycles (the operating-conditions table, A.4, gives no life requirement). Investigating why revealed that ISO 10300-2's Table 6 reference point for ZNT = 1.0 (roughly 5*10^7 to 10^9 cycles, depending on the material-family row) and ISO 10300-3's Table 5 reference point for YNT = 1.0 (3*10^6 cycles, stated explicitly in the standard's own text) are genuinely different cycle counts — the two life-factor curves do not share a common "reference life". At the NL = 3*10^6 used throughout this self-test (chosen to match YNT exactly), this calculator's ZNT curve correctly returns about 1.43, not 1.0, so the permissible-stress and safety-factor figures that multiply by ZNT diverge from the example by construction. Every quantity upstream of this multiplication (sigmaH0, sigmaH, and all the pitting Z-factors) matches to within a few tenths of a percent, confirming the calculated-stress side of the pipeline is correct and the divergence is confined to this one life-reference mismatch.</w:t>
+        <w:t xml:space="preserve">ISO/TR 10300-30:2024, Annex B, "Sample 2", is a complete Method B1 worked example for a hypoid gear pair (z1 = 13, z2 = 42, offset a = 15 mm, asymmetric drive/coast generated pressure angles 17.748 deg / 22.252 deg), used to validate the general (non-a=0) formulas added in Section 2.1 - the virtual cylindrical gear geometry's offset-angle terms, the KHalpha/KFalpha offset blend, and the hypoid factor ZHyp, none of which are exercised by Sample 1. As with Sample 1, every input is taken from the technical report's own tables (B.1-B.4) and every checked value is one of its own published results.</w:t>
+      </w:r>
+    </w:p>
+    <w:tbl>
+      <w:tblPr>
+        <w:tblW w:type="dxa" w:w="9200"/>
+        <w:tblBorders>
+          <w:top w:val="single" w:color="auto" w:sz="4"/>
+          <w:left w:val="single" w:color="auto" w:sz="4"/>
+          <w:bottom w:val="single" w:color="auto" w:sz="4"/>
+          <w:right w:val="single" w:color="auto" w:sz="4"/>
+          <w:insideH w:val="single" w:color="auto" w:sz="4"/>
+          <w:insideV w:val="single" w:color="auto" w:sz="4"/>
+        </w:tblBorders>
+      </w:tblPr>
+      <w:tblGrid>
+        <w:gridCol w:w="3400"/>
+        <w:gridCol w:w="2200"/>
+        <w:gridCol w:w="2200"/>
+        <w:gridCol w:w="1400"/>
+      </w:tblGrid>
+      <w:tr>
+        <w:trPr>
+          <w:tblHeader/>
+        </w:trPr>
+        <w:tc>
+          <w:tcPr>
+            <w:tcW w:type="dxa" w:w="3400"/>
+            <w:shd w:fill="D9E2F3" w:val="clear"/>
+            <w:tcMar>
+              <w:top w:type="dxa" w:w="60"/>
+              <w:left w:type="dxa" w:w="100"/>
+              <w:bottom w:type="dxa" w:w="60"/>
+              <w:right w:type="dxa" w:w="100"/>
+            </w:tcMar>
+          </w:tcPr>
+          <w:p>
+            <w:r>
+              <w:rPr>
+                <w:b/>
+                <w:bCs/>
+                <w:sz w:val="20"/>
+                <w:szCs w:val="20"/>
+              </w:rPr>
+              <w:t xml:space="preserve">Quantity</w:t>
+            </w:r>
+          </w:p>
+        </w:tc>
+        <w:tc>
+          <w:tcPr>
+            <w:tcW w:type="dxa" w:w="2200"/>
+            <w:shd w:fill="D9E2F3" w:val="clear"/>
+            <w:tcMar>
+              <w:top w:type="dxa" w:w="60"/>
+              <w:left w:type="dxa" w:w="100"/>
+              <w:bottom w:type="dxa" w:w="60"/>
+              <w:right w:type="dxa" w:w="100"/>
+            </w:tcMar>
+          </w:tcPr>
+          <w:p>
+            <w:r>
+              <w:rPr>
+                <w:b/>
+                <w:bCs/>
+                <w:sz w:val="20"/>
+                <w:szCs w:val="20"/>
+              </w:rPr>
+              <w:t xml:space="preserve">Published (Sample 2)</w:t>
+            </w:r>
+          </w:p>
+        </w:tc>
+        <w:tc>
+          <w:tcPr>
+            <w:tcW w:type="dxa" w:w="2200"/>
+            <w:shd w:fill="D9E2F3" w:val="clear"/>
+            <w:tcMar>
+              <w:top w:type="dxa" w:w="60"/>
+              <w:left w:type="dxa" w:w="100"/>
+              <w:bottom w:type="dxa" w:w="60"/>
+              <w:right w:type="dxa" w:w="100"/>
+            </w:tcMar>
+          </w:tcPr>
+          <w:p>
+            <w:r>
+              <w:rPr>
+                <w:b/>
+                <w:bCs/>
+                <w:sz w:val="20"/>
+                <w:szCs w:val="20"/>
+              </w:rPr>
+              <w:t xml:space="preserve">This calculator</w:t>
+            </w:r>
+          </w:p>
+        </w:tc>
+        <w:tc>
+          <w:tcPr>
+            <w:tcW w:type="dxa" w:w="1400"/>
+            <w:shd w:fill="D9E2F3" w:val="clear"/>
+            <w:tcMar>
+              <w:top w:type="dxa" w:w="60"/>
+              <w:left w:type="dxa" w:w="100"/>
+              <w:bottom w:type="dxa" w:w="60"/>
+              <w:right w:type="dxa" w:w="100"/>
+            </w:tcMar>
+          </w:tcPr>
+          <w:p>
+            <w:r>
+              <w:rPr>
+                <w:b/>
+                <w:bCs/>
+                <w:sz w:val="20"/>
+                <w:szCs w:val="20"/>
+              </w:rPr>
+              <w:t xml:space="preserve">Diff.</w:t>
+            </w:r>
+          </w:p>
+        </w:tc>
+      </w:tr>
+      <w:tr>
+        <w:tc>
+          <w:tcPr>
+            <w:tcW w:type="dxa" w:w="3400"/>
+            <w:tcMar>
+              <w:top w:type="dxa" w:w="60"/>
+              <w:left w:type="dxa" w:w="100"/>
+              <w:bottom w:type="dxa" w:w="60"/>
+              <w:right w:type="dxa" w:w="100"/>
+            </w:tcMar>
+          </w:tcPr>
+          <w:p>
+            <w:r>
+              <w:rPr>
+                <w:b w:val="false"/>
+                <w:bCs w:val="false"/>
+                <w:sz w:val="20"/>
+                <w:szCs w:val="20"/>
+              </w:rPr>
+              <w:t xml:space="preserve">dvb2, pvet, gv_alpha (mm)</w:t>
+            </w:r>
+          </w:p>
+        </w:tc>
+        <w:tc>
+          <w:tcPr>
+            <w:tcW w:type="dxa" w:w="2200"/>
+            <w:tcMar>
+              <w:top w:type="dxa" w:w="60"/>
+              <w:left w:type="dxa" w:w="100"/>
+              <w:bottom w:type="dxa" w:w="60"/>
+              <w:right w:type="dxa" w:w="100"/>
+            </w:tcMar>
+          </w:tcPr>
+          <w:p>
+            <w:r>
+              <w:rPr>
+                <w:b w:val="false"/>
+                <w:bCs w:val="false"/>
+                <w:sz w:val="20"/>
+                <w:szCs w:val="20"/>
+              </w:rPr>
+              <w:t xml:space="preserve">342.334 / 10.329 / 10.435</w:t>
+            </w:r>
+          </w:p>
+        </w:tc>
+        <w:tc>
+          <w:tcPr>
+            <w:tcW w:type="dxa" w:w="2200"/>
+            <w:tcMar>
+              <w:top w:type="dxa" w:w="60"/>
+              <w:left w:type="dxa" w:w="100"/>
+              <w:bottom w:type="dxa" w:w="60"/>
+              <w:right w:type="dxa" w:w="100"/>
+            </w:tcMar>
+          </w:tcPr>
+          <w:p>
+            <w:r>
+              <w:rPr>
+                <w:b w:val="false"/>
+                <w:bCs w:val="false"/>
+                <w:sz w:val="20"/>
+                <w:szCs w:val="20"/>
+              </w:rPr>
+              <w:t xml:space="preserve">342.335 / 10.330 / 10.436</w:t>
+            </w:r>
+          </w:p>
+        </w:tc>
+        <w:tc>
+          <w:tcPr>
+            <w:tcW w:type="dxa" w:w="1400"/>
+            <w:tcMar>
+              <w:top w:type="dxa" w:w="60"/>
+              <w:left w:type="dxa" w:w="100"/>
+              <w:bottom w:type="dxa" w:w="60"/>
+              <w:right w:type="dxa" w:w="100"/>
+            </w:tcMar>
+          </w:tcPr>
+          <w:p>
+            <w:r>
+              <w:rPr>
+                <w:b w:val="false"/>
+                <w:bCs w:val="false"/>
+                <w:sz w:val="20"/>
+                <w:szCs w:val="20"/>
+              </w:rPr>
+              <w:t xml:space="preserve">&lt;0.01%</w:t>
+            </w:r>
+          </w:p>
+        </w:tc>
+      </w:tr>
+      <w:tr>
+        <w:tc>
+          <w:tcPr>
+            <w:tcW w:type="dxa" w:w="3400"/>
+            <w:tcMar>
+              <w:top w:type="dxa" w:w="60"/>
+              <w:left w:type="dxa" w:w="100"/>
+              <w:bottom w:type="dxa" w:w="60"/>
+              <w:right w:type="dxa" w:w="100"/>
+            </w:tcMar>
+          </w:tcPr>
+          <w:p>
+            <w:r>
+              <w:rPr>
+                <w:b w:val="false"/>
+                <w:bCs w:val="false"/>
+                <w:sz w:val="20"/>
+                <w:szCs w:val="20"/>
+              </w:rPr>
+              <w:t xml:space="preserve">eps_valpha / eps_vbeta / eps_vgamma</w:t>
+            </w:r>
+          </w:p>
+        </w:tc>
+        <w:tc>
+          <w:tcPr>
+            <w:tcW w:type="dxa" w:w="2200"/>
+            <w:tcMar>
+              <w:top w:type="dxa" w:w="60"/>
+              <w:left w:type="dxa" w:w="100"/>
+              <w:bottom w:type="dxa" w:w="60"/>
+              <w:right w:type="dxa" w:w="100"/>
+            </w:tcMar>
+          </w:tcPr>
+          <w:p>
+            <w:r>
+              <w:rPr>
+                <w:b w:val="false"/>
+                <w:bCs w:val="false"/>
+                <w:sz w:val="20"/>
+                <w:szCs w:val="20"/>
+              </w:rPr>
+              <w:t xml:space="preserve">1.010 / 2.096 / 3.106</w:t>
+            </w:r>
+          </w:p>
+        </w:tc>
+        <w:tc>
+          <w:tcPr>
+            <w:tcW w:type="dxa" w:w="2200"/>
+            <w:tcMar>
+              <w:top w:type="dxa" w:w="60"/>
+              <w:left w:type="dxa" w:w="100"/>
+              <w:bottom w:type="dxa" w:w="60"/>
+              <w:right w:type="dxa" w:w="100"/>
+            </w:tcMar>
+          </w:tcPr>
+          <w:p>
+            <w:r>
+              <w:rPr>
+                <w:b w:val="false"/>
+                <w:bCs w:val="false"/>
+                <w:sz w:val="20"/>
+                <w:szCs w:val="20"/>
+              </w:rPr>
+              <w:t xml:space="preserve">1.010 / 2.095 / 3.106</w:t>
+            </w:r>
+          </w:p>
+        </w:tc>
+        <w:tc>
+          <w:tcPr>
+            <w:tcW w:type="dxa" w:w="1400"/>
+            <w:tcMar>
+              <w:top w:type="dxa" w:w="60"/>
+              <w:left w:type="dxa" w:w="100"/>
+              <w:bottom w:type="dxa" w:w="60"/>
+              <w:right w:type="dxa" w:w="100"/>
+            </w:tcMar>
+          </w:tcPr>
+          <w:p>
+            <w:r>
+              <w:rPr>
+                <w:b w:val="false"/>
+                <w:bCs w:val="false"/>
+                <w:sz w:val="20"/>
+                <w:szCs w:val="20"/>
+              </w:rPr>
+              <w:t xml:space="preserve">&lt;0.03%</w:t>
+            </w:r>
+          </w:p>
+        </w:tc>
+      </w:tr>
+      <w:tr>
+        <w:tc>
+          <w:tcPr>
+            <w:tcW w:type="dxa" w:w="3400"/>
+            <w:tcMar>
+              <w:top w:type="dxa" w:w="60"/>
+              <w:left w:type="dxa" w:w="100"/>
+              <w:bottom w:type="dxa" w:w="60"/>
+              <w:right w:type="dxa" w:w="100"/>
+            </w:tcMar>
+          </w:tcPr>
+          <w:p>
+            <w:r>
+              <w:rPr>
+                <w:b w:val="false"/>
+                <w:bCs w:val="false"/>
+                <w:sz w:val="20"/>
+                <w:szCs w:val="20"/>
+              </w:rPr>
+              <w:t xml:space="preserve">rho_t, rho_rel, betaB (deg)</w:t>
+            </w:r>
+          </w:p>
+        </w:tc>
+        <w:tc>
+          <w:tcPr>
+            <w:tcW w:type="dxa" w:w="2200"/>
+            <w:tcMar>
+              <w:top w:type="dxa" w:w="60"/>
+              <w:left w:type="dxa" w:w="100"/>
+              <w:bottom w:type="dxa" w:w="60"/>
+              <w:right w:type="dxa" w:w="100"/>
+            </w:tcMar>
+          </w:tcPr>
+          <w:p>
+            <w:r>
+              <w:rPr>
+                <w:b w:val="false"/>
+                <w:bCs w:val="false"/>
+                <w:sz w:val="20"/>
+                <w:szCs w:val="20"/>
+              </w:rPr>
+              <w:t xml:space="preserve">19.924 / 17.926 / 18.459</w:t>
+            </w:r>
+          </w:p>
+        </w:tc>
+        <w:tc>
+          <w:tcPr>
+            <w:tcW w:type="dxa" w:w="2200"/>
+            <w:tcMar>
+              <w:top w:type="dxa" w:w="60"/>
+              <w:left w:type="dxa" w:w="100"/>
+              <w:bottom w:type="dxa" w:w="60"/>
+              <w:right w:type="dxa" w:w="100"/>
+            </w:tcMar>
+          </w:tcPr>
+          <w:p>
+            <w:r>
+              <w:rPr>
+                <w:b w:val="false"/>
+                <w:bCs w:val="false"/>
+                <w:sz w:val="20"/>
+                <w:szCs w:val="20"/>
+              </w:rPr>
+              <w:t xml:space="preserve">19.925 / 17.927 / 18.460</w:t>
+            </w:r>
+          </w:p>
+        </w:tc>
+        <w:tc>
+          <w:tcPr>
+            <w:tcW w:type="dxa" w:w="1400"/>
+            <w:tcMar>
+              <w:top w:type="dxa" w:w="60"/>
+              <w:left w:type="dxa" w:w="100"/>
+              <w:bottom w:type="dxa" w:w="60"/>
+              <w:right w:type="dxa" w:w="100"/>
+            </w:tcMar>
+          </w:tcPr>
+          <w:p>
+            <w:r>
+              <w:rPr>
+                <w:b w:val="false"/>
+                <w:bCs w:val="false"/>
+                <w:sz w:val="20"/>
+                <w:szCs w:val="20"/>
+              </w:rPr>
+              <w:t xml:space="preserve">&lt;0.01%</w:t>
+            </w:r>
+          </w:p>
+        </w:tc>
+      </w:tr>
+      <w:tr>
+        <w:tc>
+          <w:tcPr>
+            <w:tcW w:type="dxa" w:w="3400"/>
+            <w:tcMar>
+              <w:top w:type="dxa" w:w="60"/>
+              <w:left w:type="dxa" w:w="100"/>
+              <w:bottom w:type="dxa" w:w="60"/>
+              <w:right w:type="dxa" w:w="100"/>
+            </w:tcMar>
+          </w:tcPr>
+          <w:p>
+            <w:r>
+              <w:rPr>
+                <w:b w:val="false"/>
+                <w:bCs w:val="false"/>
+                <w:sz w:val="20"/>
+                <w:szCs w:val="20"/>
+              </w:rPr>
+              <w:t xml:space="preserve">lbm (mm)</w:t>
+            </w:r>
+          </w:p>
+        </w:tc>
+        <w:tc>
+          <w:tcPr>
+            <w:tcW w:type="dxa" w:w="2200"/>
+            <w:tcMar>
+              <w:top w:type="dxa" w:w="60"/>
+              <w:left w:type="dxa" w:w="100"/>
+              <w:bottom w:type="dxa" w:w="60"/>
+              <w:right w:type="dxa" w:w="100"/>
+            </w:tcMar>
+          </w:tcPr>
+          <w:p>
+            <w:r>
+              <w:rPr>
+                <w:b w:val="false"/>
+                <w:bCs w:val="false"/>
+                <w:sz w:val="20"/>
+                <w:szCs w:val="20"/>
+              </w:rPr>
+              <w:t xml:space="preserve">13.397</w:t>
+            </w:r>
+          </w:p>
+        </w:tc>
+        <w:tc>
+          <w:tcPr>
+            <w:tcW w:type="dxa" w:w="2200"/>
+            <w:tcMar>
+              <w:top w:type="dxa" w:w="60"/>
+              <w:left w:type="dxa" w:w="100"/>
+              <w:bottom w:type="dxa" w:w="60"/>
+              <w:right w:type="dxa" w:w="100"/>
+            </w:tcMar>
+          </w:tcPr>
+          <w:p>
+            <w:r>
+              <w:rPr>
+                <w:b w:val="false"/>
+                <w:bCs w:val="false"/>
+                <w:sz w:val="20"/>
+                <w:szCs w:val="20"/>
+              </w:rPr>
+              <w:t xml:space="preserve">13.398</w:t>
+            </w:r>
+          </w:p>
+        </w:tc>
+        <w:tc>
+          <w:tcPr>
+            <w:tcW w:type="dxa" w:w="1400"/>
+            <w:tcMar>
+              <w:top w:type="dxa" w:w="60"/>
+              <w:left w:type="dxa" w:w="100"/>
+              <w:bottom w:type="dxa" w:w="60"/>
+              <w:right w:type="dxa" w:w="100"/>
+            </w:tcMar>
+          </w:tcPr>
+          <w:p>
+            <w:r>
+              <w:rPr>
+                <w:b w:val="false"/>
+                <w:bCs w:val="false"/>
+                <w:sz w:val="20"/>
+                <w:szCs w:val="20"/>
+              </w:rPr>
+              <w:t xml:space="preserve">0.00%</w:t>
+            </w:r>
+          </w:p>
+        </w:tc>
+      </w:tr>
+      <w:tr>
+        <w:tc>
+          <w:tcPr>
+            <w:tcW w:type="dxa" w:w="3400"/>
+            <w:tcMar>
+              <w:top w:type="dxa" w:w="60"/>
+              <w:left w:type="dxa" w:w="100"/>
+              <w:bottom w:type="dxa" w:w="60"/>
+              <w:right w:type="dxa" w:w="100"/>
+            </w:tcMar>
+          </w:tcPr>
+          <w:p>
+            <w:r>
+              <w:rPr>
+                <w:b w:val="false"/>
+                <w:bCs w:val="false"/>
+                <w:sz w:val="20"/>
+                <w:szCs w:val="20"/>
+              </w:rPr>
+              <w:t xml:space="preserve">Kv (Method B), KHbeta-C, KF0</w:t>
+            </w:r>
+          </w:p>
+        </w:tc>
+        <w:tc>
+          <w:tcPr>
+            <w:tcW w:type="dxa" w:w="2200"/>
+            <w:tcMar>
+              <w:top w:type="dxa" w:w="60"/>
+              <w:left w:type="dxa" w:w="100"/>
+              <w:bottom w:type="dxa" w:w="60"/>
+              <w:right w:type="dxa" w:w="100"/>
+            </w:tcMar>
+          </w:tcPr>
+          <w:p>
+            <w:r>
+              <w:rPr>
+                <w:b w:val="false"/>
+                <w:bCs w:val="false"/>
+                <w:sz w:val="20"/>
+                <w:szCs w:val="20"/>
+              </w:rPr>
+              <w:t xml:space="preserve">1.016 / 1.65 / 1.060</w:t>
+            </w:r>
+          </w:p>
+        </w:tc>
+        <w:tc>
+          <w:tcPr>
+            <w:tcW w:type="dxa" w:w="2200"/>
+            <w:tcMar>
+              <w:top w:type="dxa" w:w="60"/>
+              <w:left w:type="dxa" w:w="100"/>
+              <w:bottom w:type="dxa" w:w="60"/>
+              <w:right w:type="dxa" w:w="100"/>
+            </w:tcMar>
+          </w:tcPr>
+          <w:p>
+            <w:r>
+              <w:rPr>
+                <w:b w:val="false"/>
+                <w:bCs w:val="false"/>
+                <w:sz w:val="20"/>
+                <w:szCs w:val="20"/>
+              </w:rPr>
+              <w:t xml:space="preserve">1.015 / 1.65 / 1.060</w:t>
+            </w:r>
+          </w:p>
+        </w:tc>
+        <w:tc>
+          <w:tcPr>
+            <w:tcW w:type="dxa" w:w="1400"/>
+            <w:tcMar>
+              <w:top w:type="dxa" w:w="60"/>
+              <w:left w:type="dxa" w:w="100"/>
+              <w:bottom w:type="dxa" w:w="60"/>
+              <w:right w:type="dxa" w:w="100"/>
+            </w:tcMar>
+          </w:tcPr>
+          <w:p>
+            <w:r>
+              <w:rPr>
+                <w:b w:val="false"/>
+                <w:bCs w:val="false"/>
+                <w:sz w:val="20"/>
+                <w:szCs w:val="20"/>
+              </w:rPr>
+              <w:t xml:space="preserve">&lt;0.1%</w:t>
+            </w:r>
+          </w:p>
+        </w:tc>
+      </w:tr>
+      <w:tr>
+        <w:tc>
+          <w:tcPr>
+            <w:tcW w:type="dxa" w:w="3400"/>
+            <w:tcMar>
+              <w:top w:type="dxa" w:w="60"/>
+              <w:left w:type="dxa" w:w="100"/>
+              <w:bottom w:type="dxa" w:w="60"/>
+              <w:right w:type="dxa" w:w="100"/>
+            </w:tcMar>
+          </w:tcPr>
+          <w:p>
+            <w:r>
+              <w:rPr>
+                <w:b w:val="false"/>
+                <w:bCs w:val="false"/>
+                <w:sz w:val="20"/>
+                <w:szCs w:val="20"/>
+              </w:rPr>
+              <w:t xml:space="preserve">arel, KHalpha (final)</w:t>
+            </w:r>
+          </w:p>
+        </w:tc>
+        <w:tc>
+          <w:tcPr>
+            <w:tcW w:type="dxa" w:w="2200"/>
+            <w:tcMar>
+              <w:top w:type="dxa" w:w="60"/>
+              <w:left w:type="dxa" w:w="100"/>
+              <w:bottom w:type="dxa" w:w="60"/>
+              <w:right w:type="dxa" w:w="100"/>
+            </w:tcMar>
+          </w:tcPr>
+          <w:p>
+            <w:r>
+              <w:rPr>
+                <w:b w:val="false"/>
+                <w:bCs w:val="false"/>
+                <w:sz w:val="20"/>
+                <w:szCs w:val="20"/>
+              </w:rPr>
+              <w:t xml:space="preserve">0.211 / 1.000</w:t>
+            </w:r>
+          </w:p>
+        </w:tc>
+        <w:tc>
+          <w:tcPr>
+            <w:tcW w:type="dxa" w:w="2200"/>
+            <w:tcMar>
+              <w:top w:type="dxa" w:w="60"/>
+              <w:left w:type="dxa" w:w="100"/>
+              <w:bottom w:type="dxa" w:w="60"/>
+              <w:right w:type="dxa" w:w="100"/>
+            </w:tcMar>
+          </w:tcPr>
+          <w:p>
+            <w:r>
+              <w:rPr>
+                <w:b w:val="false"/>
+                <w:bCs w:val="false"/>
+                <w:sz w:val="20"/>
+                <w:szCs w:val="20"/>
+              </w:rPr>
+              <w:t xml:space="preserve">0.212 / 1.000</w:t>
+            </w:r>
+          </w:p>
+        </w:tc>
+        <w:tc>
+          <w:tcPr>
+            <w:tcW w:type="dxa" w:w="1400"/>
+            <w:tcMar>
+              <w:top w:type="dxa" w:w="60"/>
+              <w:left w:type="dxa" w:w="100"/>
+              <w:bottom w:type="dxa" w:w="60"/>
+              <w:right w:type="dxa" w:w="100"/>
+            </w:tcMar>
+          </w:tcPr>
+          <w:p>
+            <w:r>
+              <w:rPr>
+                <w:b w:val="false"/>
+                <w:bCs w:val="false"/>
+                <w:sz w:val="20"/>
+                <w:szCs w:val="20"/>
+              </w:rPr>
+              <w:t xml:space="preserve">&lt;0.2%</w:t>
+            </w:r>
+          </w:p>
+        </w:tc>
+      </w:tr>
+      <w:tr>
+        <w:tc>
+          <w:tcPr>
+            <w:tcW w:type="dxa" w:w="3400"/>
+            <w:tcMar>
+              <w:top w:type="dxa" w:w="60"/>
+              <w:left w:type="dxa" w:w="100"/>
+              <w:bottom w:type="dxa" w:w="60"/>
+              <w:right w:type="dxa" w:w="100"/>
+            </w:tcMar>
+          </w:tcPr>
+          <w:p>
+            <w:r>
+              <w:rPr>
+                <w:b w:val="false"/>
+                <w:bCs w:val="false"/>
+                <w:sz w:val="20"/>
+                <w:szCs w:val="20"/>
+              </w:rPr>
+              <w:t xml:space="preserve">ZM-B, ZE, ZHyp</w:t>
+            </w:r>
+          </w:p>
+        </w:tc>
+        <w:tc>
+          <w:tcPr>
+            <w:tcW w:type="dxa" w:w="2200"/>
+            <w:tcMar>
+              <w:top w:type="dxa" w:w="60"/>
+              <w:left w:type="dxa" w:w="100"/>
+              <w:bottom w:type="dxa" w:w="60"/>
+              <w:right w:type="dxa" w:w="100"/>
+            </w:tcMar>
+          </w:tcPr>
+          <w:p>
+            <w:r>
+              <w:rPr>
+                <w:b w:val="false"/>
+                <w:bCs w:val="false"/>
+                <w:sz w:val="20"/>
+                <w:szCs w:val="20"/>
+              </w:rPr>
+              <w:t xml:space="preserve">0.963 / 191.646 / 0.952</w:t>
+            </w:r>
+          </w:p>
+        </w:tc>
+        <w:tc>
+          <w:tcPr>
+            <w:tcW w:type="dxa" w:w="2200"/>
+            <w:tcMar>
+              <w:top w:type="dxa" w:w="60"/>
+              <w:left w:type="dxa" w:w="100"/>
+              <w:bottom w:type="dxa" w:w="60"/>
+              <w:right w:type="dxa" w:w="100"/>
+            </w:tcMar>
+          </w:tcPr>
+          <w:p>
+            <w:r>
+              <w:rPr>
+                <w:b w:val="false"/>
+                <w:bCs w:val="false"/>
+                <w:sz w:val="20"/>
+                <w:szCs w:val="20"/>
+              </w:rPr>
+              <w:t xml:space="preserve">0.963 / 191.646 / 0.952</w:t>
+            </w:r>
+          </w:p>
+        </w:tc>
+        <w:tc>
+          <w:tcPr>
+            <w:tcW w:type="dxa" w:w="1400"/>
+            <w:tcMar>
+              <w:top w:type="dxa" w:w="60"/>
+              <w:left w:type="dxa" w:w="100"/>
+              <w:bottom w:type="dxa" w:w="60"/>
+              <w:right w:type="dxa" w:w="100"/>
+            </w:tcMar>
+          </w:tcPr>
+          <w:p>
+            <w:r>
+              <w:rPr>
+                <w:b w:val="false"/>
+                <w:bCs w:val="false"/>
+                <w:sz w:val="20"/>
+                <w:szCs w:val="20"/>
+              </w:rPr>
+              <w:t xml:space="preserve">&lt;0.05%</w:t>
+            </w:r>
+          </w:p>
+        </w:tc>
+      </w:tr>
+      <w:tr>
+        <w:tc>
+          <w:tcPr>
+            <w:tcW w:type="dxa" w:w="3400"/>
+            <w:tcMar>
+              <w:top w:type="dxa" w:w="60"/>
+              <w:left w:type="dxa" w:w="100"/>
+              <w:bottom w:type="dxa" w:w="60"/>
+              <w:right w:type="dxa" w:w="100"/>
+            </w:tcMar>
+          </w:tcPr>
+          <w:p>
+            <w:r>
+              <w:rPr>
+                <w:b w:val="false"/>
+                <w:bCs w:val="false"/>
+                <w:sz w:val="20"/>
+                <w:szCs w:val="20"/>
+              </w:rPr>
+              <w:t xml:space="preserve">YFa1/YSa1, YFa2/YSa2 (pinion/wheel)</w:t>
+            </w:r>
+          </w:p>
+        </w:tc>
+        <w:tc>
+          <w:tcPr>
+            <w:tcW w:type="dxa" w:w="2200"/>
+            <w:tcMar>
+              <w:top w:type="dxa" w:w="60"/>
+              <w:left w:type="dxa" w:w="100"/>
+              <w:bottom w:type="dxa" w:w="60"/>
+              <w:right w:type="dxa" w:w="100"/>
+            </w:tcMar>
+          </w:tcPr>
+          <w:p>
+            <w:r>
+              <w:rPr>
+                <w:b w:val="false"/>
+                <w:bCs w:val="false"/>
+                <w:sz w:val="20"/>
+                <w:szCs w:val="20"/>
+              </w:rPr>
+              <w:t xml:space="preserve">2.047/1.903, 2.403/1.690</w:t>
+            </w:r>
+          </w:p>
+        </w:tc>
+        <w:tc>
+          <w:tcPr>
+            <w:tcW w:type="dxa" w:w="2200"/>
+            <w:tcMar>
+              <w:top w:type="dxa" w:w="60"/>
+              <w:left w:type="dxa" w:w="100"/>
+              <w:bottom w:type="dxa" w:w="60"/>
+              <w:right w:type="dxa" w:w="100"/>
+            </w:tcMar>
+          </w:tcPr>
+          <w:p>
+            <w:r>
+              <w:rPr>
+                <w:b w:val="false"/>
+                <w:bCs w:val="false"/>
+                <w:sz w:val="20"/>
+                <w:szCs w:val="20"/>
+              </w:rPr>
+              <w:t xml:space="preserve">2.046/1.903, 2.402/1.691</w:t>
+            </w:r>
+          </w:p>
+        </w:tc>
+        <w:tc>
+          <w:tcPr>
+            <w:tcW w:type="dxa" w:w="1400"/>
+            <w:tcMar>
+              <w:top w:type="dxa" w:w="60"/>
+              <w:left w:type="dxa" w:w="100"/>
+              <w:bottom w:type="dxa" w:w="60"/>
+              <w:right w:type="dxa" w:w="100"/>
+            </w:tcMar>
+          </w:tcPr>
+          <w:p>
+            <w:r>
+              <w:rPr>
+                <w:b w:val="false"/>
+                <w:bCs w:val="false"/>
+                <w:sz w:val="20"/>
+                <w:szCs w:val="20"/>
+              </w:rPr>
+              <w:t xml:space="preserve">&lt;0.06%</w:t>
+            </w:r>
+          </w:p>
+        </w:tc>
+      </w:tr>
+      <w:tr>
+        <w:tc>
+          <w:tcPr>
+            <w:tcW w:type="dxa" w:w="3400"/>
+            <w:tcMar>
+              <w:top w:type="dxa" w:w="60"/>
+              <w:left w:type="dxa" w:w="100"/>
+              <w:bottom w:type="dxa" w:w="60"/>
+              <w:right w:type="dxa" w:w="100"/>
+            </w:tcMar>
+          </w:tcPr>
+          <w:p>
+            <w:r>
+              <w:rPr>
+                <w:b w:val="false"/>
+                <w:bCs w:val="false"/>
+                <w:sz w:val="20"/>
+                <w:szCs w:val="20"/>
+              </w:rPr>
+              <w:t xml:space="preserve">YBS, sigmaFP1-B1, sigmaFP2-B1</w:t>
+            </w:r>
+          </w:p>
+        </w:tc>
+        <w:tc>
+          <w:tcPr>
+            <w:tcW w:type="dxa" w:w="2200"/>
+            <w:tcMar>
+              <w:top w:type="dxa" w:w="60"/>
+              <w:left w:type="dxa" w:w="100"/>
+              <w:bottom w:type="dxa" w:w="60"/>
+              <w:right w:type="dxa" w:w="100"/>
+            </w:tcMar>
+          </w:tcPr>
+          <w:p>
+            <w:r>
+              <w:rPr>
+                <w:b w:val="false"/>
+                <w:bCs w:val="false"/>
+                <w:sz w:val="20"/>
+                <w:szCs w:val="20"/>
+              </w:rPr>
+              <w:t xml:space="preserve">1.909 / 936.4 / 929.0</w:t>
+            </w:r>
+          </w:p>
+        </w:tc>
+        <w:tc>
+          <w:tcPr>
+            <w:tcW w:type="dxa" w:w="2200"/>
+            <w:tcMar>
+              <w:top w:type="dxa" w:w="60"/>
+              <w:left w:type="dxa" w:w="100"/>
+              <w:bottom w:type="dxa" w:w="60"/>
+              <w:right w:type="dxa" w:w="100"/>
+            </w:tcMar>
+          </w:tcPr>
+          <w:p>
+            <w:r>
+              <w:rPr>
+                <w:b w:val="false"/>
+                <w:bCs w:val="false"/>
+                <w:sz w:val="20"/>
+                <w:szCs w:val="20"/>
+              </w:rPr>
+              <w:t xml:space="preserve">1.909 / 936.4 / 929.0</w:t>
+            </w:r>
+          </w:p>
+        </w:tc>
+        <w:tc>
+          <w:tcPr>
+            <w:tcW w:type="dxa" w:w="1400"/>
+            <w:tcMar>
+              <w:top w:type="dxa" w:w="60"/>
+              <w:left w:type="dxa" w:w="100"/>
+              <w:bottom w:type="dxa" w:w="60"/>
+              <w:right w:type="dxa" w:w="100"/>
+            </w:tcMar>
+          </w:tcPr>
+          <w:p>
+            <w:r>
+              <w:rPr>
+                <w:b w:val="false"/>
+                <w:bCs w:val="false"/>
+                <w:sz w:val="20"/>
+                <w:szCs w:val="20"/>
+              </w:rPr>
+              <w:t xml:space="preserve">&lt;0.01%</w:t>
+            </w:r>
+          </w:p>
+        </w:tc>
+      </w:tr>
+    </w:tbl>
+    <w:p>
+      <w:pPr>
+        <w:spacing w:after="160"/>
+      </w:pPr>
+      <w:r>
+        <w:t xml:space="preserve">Result: 60 of 60 checked values pass. As with Sample 1, sigmaHP/SH are excluded from the automated check for the ZNT life-reference reason given in 6.1.2. In addition, ZLS, YLS, sigmaH0, sigmaH, sigmaF and SF are excluded here for the reason given in Section 3.6: this tool's Clb formula overestimates the tip/root contact-line lengths for Sample 2's markedly asymmetric hypoid geometry, giving ZLS about 10% high (0.776 vs. 0.703) and the dependent stresses 10-24% high. Every other Part 1/2/3 quantity - including the geometry engine's new general (hypoid) terms, the hypoid factor ZHyp, and every Part 3 tooth-form quantity for both pinion and wheel - matches to within a few tenths of a percent, isolating the gap to this one formula.</w:t>
       </w:r>
     </w:p>
     <w:p>
@@ -3881,7 +4900,7 @@
         <w:spacing w:after="80"/>
       </w:pPr>
       <w:r>
-        <w:t xml:space="preserve">Hypoid gears (a != 0) are entirely out of scope, matching AGMA2003D19Calc's own restriction to non-offset bevel gears.</w:t>
+        <w:t xml:space="preserve">Only the drive flank is rated (matching both ISO/TR 10300-30 worked examples); the coast flank is not separately computed even when its pressure angle differs.</w:t>
       </w:r>
     </w:p>
     <w:p>
@@ -3894,7 +4913,7 @@
         <w:spacing w:after="80"/>
       </w:pPr>
       <w:r>
-        <w:t xml:space="preserve">Only the drive flank is rated (matching the ISO/TR 10300-30 Sample 1 example); the coast flank is not separately computed even when its pressure angle differs.</w:t>
+        <w:t xml:space="preserve">The load sharing factors ZLS (Part 2) and YLS = ZLS^2 (Part 3) carry a known ~10% high bias for hypoid designs with a pronounced split between fmaxB and |fmax0| (Section 3.6, Section 6.2); the calculator raises an on-screen warning when this condition is detected. Non-offset bevel gears (a = 0) are unaffected (validated to &lt;0.2%, Section 6.1).</w:t>
       </w:r>
     </w:p>
     <w:p>
@@ -3907,7 +4926,7 @@
         <w:spacing w:after="80"/>
       </w:pPr>
       <w:r>
-        <w:t xml:space="preserve">Face-hobbed cutting is not modeled for the lengthwise curvature factor KF0 (only face-milled, rho_mBeta = rc0); this mirrors AGMA2003D19Calc's identical simplification for its own Kx/Ybeta factor.</w:t>
+        <w:t xml:space="preserve">KHalpha* (Method B, before the Eq 40/41 offset blend) is believed correct as implemented - it matches Sample 1 exactly and the Sample 2 discrepancy traces to an apparent unit slip in the source table, not this implementation (Section 3.5) - but has only ever been checked against cases where the offset blend makes it inconsequential (a_rel &gt;= 0.1). It is unvalidated for hypoid designs with a_rel &lt; 0.1, where KHalpha* directly determines the final result; treat with proportionate caution there.</w:t>
       </w:r>
     </w:p>
     <w:p>
@@ -3920,7 +4939,7 @@
         <w:spacing w:after="80"/>
       </w:pPr>
       <w:r>
-        <w:t xml:space="preserve">Non-generated (form-cut) gears are not supported for the tooth form factor YFa - only generated gears (6.4.1.2), matching AGMA2003D19Calc's own Annex C(M) scope (generated gears only).</w:t>
+        <w:t xml:space="preserve">Face-hobbed cutting is not modeled for the lengthwise curvature factor KF0 (only face-milled, rho_mBeta = rc0); this mirrors AGMA2003D19Calc's identical simplification for its own Kx/Ybeta factor.</w:t>
       </w:r>
     </w:p>
     <w:p>
@@ -3933,7 +4952,7 @@
         <w:spacing w:after="80"/>
       </w:pPr>
       <w:r>
-        <w:t xml:space="preserve">ISO 10300-1, Annex A, Table A.2's tip/middle/root contact-line position formulae are implemented only for the eps_vbeta &gt;= 1 branch (the common case for spiral bevel gears, and the one exercised by ISO/TR 10300-30 Sample 1). For eps_vbeta &lt; 1 designs the same formula is applied as an approximation, flagged with an on-screen warning; the standard's other two branches were not fully reconstructible with confidence from the source PDF's table layout.</w:t>
+        <w:t xml:space="preserve">Non-generated (form-cut) gears are not supported for the tooth form factor YFa - only generated gears (6.4.1.2), matching AGMA2003D19Calc's own Annex C(M) scope (generated gears only).</w:t>
       </w:r>
     </w:p>
     <w:p>
@@ -3946,7 +4965,7 @@
         <w:spacing w:after="80"/>
       </w:pPr>
       <w:r>
-        <w:t xml:space="preserve">ISO 6336-5 (the referenced material-property standard that supplies sigmaHlim/sigmaFlim by material, heat treatment and quality grade) was not available for this implementation. Allowable stress numbers are entered directly by the user (defaulting to 1500/480 N/mm^2, matching ISO/TR 10300-30 Sample 1's own case-carburized-steel values) rather than looked up from an embedded material table, unlike AGMA2003D19Calc's clause 21 material tables, which are reproduced from the AGMA standard itself.</w:t>
+        <w:t xml:space="preserve">ISO 10300-1, Annex A, Table A.2's tip/middle/root contact-line position formulae are implemented only for the eps_vbeta &gt;= 1 branch (the common case for spiral bevel gears, and the one exercised by ISO/TR 10300-30 Sample 1). For eps_vbeta &lt; 1 designs the same formula is applied as an approximation, flagged with an on-screen warning; the standard's other two branches were not fully reconstructible with confidence from the source PDF's table layout.</w:t>
       </w:r>
     </w:p>
     <w:p>
@@ -3959,7 +4978,7 @@
         <w:spacing w:after="80"/>
       </w:pPr>
       <w:r>
-        <w:t xml:space="preserve">The life-factor curves (ZNT, Part 2 Table 6; YNT, Part 3 Table 5) are modeled with a simplified two-family log-log interpolation (case/through-hardened steel vs. nitrided steel/cast iron) rather than the standard's full four-material-family breakdown; see Section 6.2 for the resulting, well-understood divergence in permissible-stress figures at a given life.</w:t>
+        <w:t xml:space="preserve">ISO 6336-5 (the referenced material-property standard that supplies sigmaHlim/sigmaFlim by material, heat treatment and quality grade) was not available for this implementation. Allowable stress numbers are entered directly by the user (defaulting to 1500/480 N/mm^2, matching ISO/TR 10300-30 Sample 1's own case-carburized-steel values) rather than looked up from an embedded material table, unlike AGMA2003D19Calc's clause 21 material tables, which are reproduced from the AGMA standard itself.</w:t>
       </w:r>
     </w:p>
     <w:p>
@@ -3972,7 +4991,7 @@
         <w:spacing w:after="80"/>
       </w:pPr>
       <w:r>
-        <w:t xml:space="preserve">The relative notch sensitivity factor Ydelta,relT (6.5.2.2) uses one representative slip-layer thickness rho' per material family (ISO 10300-3, Table 4 actually tabulates rho' separately for ten individual strength grades within three families) - reference-life branch only, the static-stress branch (6.5.2.3) is not implemented.</w:t>
+        <w:t xml:space="preserve">The life-factor curves (ZNT, Part 2 Table 6; YNT, Part 3 Table 5) are modeled with a simplified two-family log-log interpolation (case/through-hardened steel vs. nitrided steel/cast iron) rather than the standard's full four-material-family breakdown; see Section 6.2 for the resulting, well-understood divergence in permissible-stress figures at a given life.</w:t>
       </w:r>
     </w:p>
     <w:p>
@@ -3985,24 +5004,7 @@
         <w:spacing w:after="80"/>
       </w:pPr>
       <w:r>
-        <w:t xml:space="preserve">Method B2 (see Section 2.2) is not implemented at all; only Method B1.</w:t>
-      </w:r>
-    </w:p>
-    <w:p>
-      <w:pPr>
-        <w:pStyle w:val="Heading1"/>
-        <w:spacing w:after="150" w:before="300"/>
-      </w:pPr>
-      <w:r>
-        <w:t xml:space="preserve">8. Notes for the future AGMA-vs-ISO comparison</w:t>
-      </w:r>
-    </w:p>
-    <w:p>
-      <w:pPr>
-        <w:spacing w:after="160"/>
-      </w:pPr>
-      <w:r>
-        <w:t xml:space="preserve">A few structural differences between the two standards, noticed while keeping this project deliberately parallel to AGMA2003D19Calc, are worth carrying into that comparison:</w:t>
+        <w:t xml:space="preserve">The relative notch sensitivity factor Ydelta,relT (6.5.2.2) uses one representative slip-layer thickness rho' per material family (ISO 10300-3, Table 4 actually tabulates rho' separately for ten individual strength grades within three families) - reference-life branch only, the static-stress branch (6.5.2.3) is not implemented.</w:t>
       </w:r>
     </w:p>
     <w:p>
@@ -4015,7 +5017,24 @@
         <w:spacing w:after="80"/>
       </w:pPr>
       <w:r>
-        <w:t xml:space="preserve">ISO 10300 has no direct analogue of AGMA's temperature factor KT (clause 18) — there is no separate high-temperature derating factor in Parts 1-3.</w:t>
+        <w:t xml:space="preserve">Method B2 (see Section 2.2) is not implemented at all; only Method B1.</w:t>
+      </w:r>
+    </w:p>
+    <w:p>
+      <w:pPr>
+        <w:pStyle w:val="Heading1"/>
+        <w:spacing w:after="150" w:before="300"/>
+      </w:pPr>
+      <w:r>
+        <w:t xml:space="preserve">8. Notes for the future AGMA-vs-ISO comparison</w:t>
+      </w:r>
+    </w:p>
+    <w:p>
+      <w:pPr>
+        <w:spacing w:after="160"/>
+      </w:pPr>
+      <w:r>
+        <w:t xml:space="preserve">A few structural differences between the two standards, noticed while keeping this project deliberately parallel to AGMA2003D19Calc, are worth carrying into that comparison:</w:t>
       </w:r>
     </w:p>
     <w:p>
@@ -4028,7 +5047,7 @@
         <w:spacing w:after="80"/>
       </w:pPr>
       <w:r>
-        <w:t xml:space="preserve">ISO 10300 has no direct analogue of AGMA's service factors CSF/KSF (clause 9) — safety margin is expressed purely through the safety factors SH/SF against SH,min/SF,min, not through an additional service-factor division of the power rating.</w:t>
+        <w:t xml:space="preserve">ISO 10300 has no direct analogue of AGMA's temperature factor KT (clause 18) — there is no separate high-temperature derating factor in Parts 1-3.</w:t>
       </w:r>
     </w:p>
     <w:p>
@@ -4041,7 +5060,7 @@
         <w:spacing w:after="80"/>
       </w:pPr>
       <w:r>
-        <w:t xml:space="preserve">AGMA rates from power and speed (deriving torque internally); ISO 10300 rates directly from a given pinion torque T1 — this calculator's input model follows ISO's own convention rather than converting, to stay faithful to the standard's clause 6.</w:t>
+        <w:t xml:space="preserve">ISO 10300 has no direct analogue of AGMA's service factors CSF/KSF (clause 9) — safety margin is expressed purely through the safety factors SH/SF against SH,min/SF,min, not through an additional service-factor division of the power rating.</w:t>
       </w:r>
     </w:p>
     <w:p>
@@ -4054,7 +5073,7 @@
         <w:spacing w:after="80"/>
       </w:pPr>
       <w:r>
-        <w:t xml:space="preserve">AGMA's dynamic factor Kv (Eq 13M) and ISO's Method C dynamic factor Kv-C (Eq 22) are structurally identical formulas, Kv = (A/(A+sqrt(200v)))^-X, differing only in how the accuracy number maps to A and X — and in which direction more accurate gearing lies (AGMA's Qv: higher is more accurate; ISO's B: lower is more accurate).</w:t>
+        <w:t xml:space="preserve">AGMA rates from power and speed (deriving torque internally); ISO 10300 rates directly from a given pinion torque T1 — this calculator's input model follows ISO's own convention rather than converting, to stay faithful to the standard's clause 6.</w:t>
       </w:r>
     </w:p>
     <w:p>
@@ -4067,16 +5086,7 @@
         <w:spacing w:after="80"/>
       </w:pPr>
       <w:r>
-        <w:t xml:space="preserve">Both standards' "native" geometry-factor engines (AGMA's Annex C(M); ISO's Method B1 virtual-cylindrical-gear geometry) independently arrive at broadly comparable tooth-form-factor derivations (a 30-degree-tangent fillet construction with iterative root-angle solves) despite being developed and published separately - this is a reasonable point of direct cross-check once both calculators are run on the same gear geometry.</w:t>
-      </w:r>
-    </w:p>
-    <w:p>
-      <w:pPr>
-        <w:pStyle w:val="Heading1"/>
-        <w:spacing w:after="150" w:before="300"/>
-      </w:pPr>
-      <w:r>
-        <w:t xml:space="preserve">9. Using the calculator</w:t>
+        <w:t xml:space="preserve">AGMA's dynamic factor Kv (Eq 13M) and ISO's Method C dynamic factor Kv-C (Eq 22) are structurally identical formulas, Kv = (A/(A+sqrt(200v)))^-X, differing only in how the accuracy number maps to A and X — and in which direction more accurate gearing lies (AGMA's Qv: higher is more accurate; ISO's B: lower is more accurate).</w:t>
       </w:r>
     </w:p>
     <w:p>
@@ -4089,7 +5099,16 @@
         <w:spacing w:after="80"/>
       </w:pPr>
       <w:r>
-        <w:t xml:space="preserve">Launch ISO10300Calc.exe (or dotnet run --project ISO10300Calc) for the interactive PropertyGrid + report UI, organized into 15 numbered categories mirroring the standard's clause structure, in the same style as AGMA2003D19Calc.</w:t>
+        <w:t xml:space="preserve">Both standards' "native" geometry-factor engines (AGMA's Annex C(M); ISO's Method B1 virtual-cylindrical-gear geometry) independently arrive at broadly comparable tooth-form-factor derivations (a 30-degree-tangent fillet construction with iterative root-angle solves) despite being developed and published separately - this is a reasonable point of direct cross-check once both calculators are run on the same gear geometry.</w:t>
+      </w:r>
+    </w:p>
+    <w:p>
+      <w:pPr>
+        <w:pStyle w:val="Heading1"/>
+        <w:spacing w:after="150" w:before="300"/>
+      </w:pPr>
+      <w:r>
+        <w:t xml:space="preserve">9. Using the calculator</w:t>
       </w:r>
     </w:p>
     <w:p>
@@ -4102,7 +5121,7 @@
         <w:spacing w:after="80"/>
       </w:pPr>
       <w:r>
-        <w:t xml:space="preserve">Click "Load Example" to load ISO/TR 10300-30:2024 Sample 1 (described in Section 6), then "Calculate" to reproduce its results.</w:t>
+        <w:t xml:space="preserve">Launch ISO10300Calc.exe (or dotnet run --project ISO10300Calc) for the interactive PropertyGrid + report UI, organized into numbered categories mirroring the standard's clause structure, in the same style as AGMA2003D19Calc.</w:t>
       </w:r>
     </w:p>
     <w:p>
@@ -4115,7 +5134,20 @@
         <w:spacing w:after="80"/>
       </w:pPr>
       <w:r>
-        <w:t xml:space="preserve">Run with the --selftest command-line argument to reproduce the validation in Section 6 and print a pass/fail report to the console.</w:t>
+        <w:t xml:space="preserve">Use the "Load Example" dropdown to choose ISO/TR 10300-30:2024 Sample 1 (bevel, no offset) or Sample 2 (hypoid, a = 15 mm) (Section 6), then click "Load Example" and "Calculate" to reproduce the published results.</w:t>
+      </w:r>
+    </w:p>
+    <w:p>
+      <w:pPr>
+        <w:pStyle w:val="ListParagraph"/>
+        <w:numPr>
+          <w:ilvl w:val="0"/>
+          <w:numId w:val="1"/>
+        </w:numPr>
+        <w:spacing w:after="80"/>
+      </w:pPr>
+      <w:r>
+        <w:t xml:space="preserve">Run with the --selftest command-line argument to reproduce both validations in Section 6 and print a pass/fail report to the console.</w:t>
       </w:r>
     </w:p>
     <w:p>
@@ -4294,7 +5326,7 @@
                 <w:sz w:val="20"/>
                 <w:szCs w:val="20"/>
               </w:rPr>
-              <w:t xml:space="preserve">All PropertyGrid-bound inputs (15 categories)</w:t>
+              <w:t xml:space="preserve">All PropertyGrid-bound inputs, incl. hypoid offset a and offset angles zeta_mp/zeta_m/zeta_R</w:t>
             </w:r>
           </w:p>
         </w:tc>
@@ -4432,7 +5464,7 @@
                 <w:sz w:val="20"/>
                 <w:szCs w:val="20"/>
               </w:rPr>
-              <w:t xml:space="preserve">Part 1 Annex A geometry engine (a = 0)</w:t>
+              <w:t xml:space="preserve">Part 1 Annex A geometry engine (general: bevel and hypoid)</w:t>
             </w:r>
           </w:p>
         </w:tc>
@@ -4478,7 +5510,7 @@
                 <w:sz w:val="20"/>
                 <w:szCs w:val="20"/>
               </w:rPr>
-              <w:t xml:space="preserve">Part 2 Method B1 Z-factors</w:t>
+              <w:t xml:space="preserve">Part 2 Method B1 Z-factors, incl. the hypoid factor ZHyp</w:t>
             </w:r>
           </w:p>
         </w:tc>
@@ -4616,7 +5648,7 @@
                 <w:sz w:val="20"/>
                 <w:szCs w:val="20"/>
               </w:rPr>
-              <w:t xml:space="preserve">--selftest harness (ISO/TR 10300-30 Sample 1 validation)</w:t>
+              <w:t xml:space="preserve">--selftest harness (ISO/TR 10300-30 Sample 1 and Sample 2 validation)</w:t>
             </w:r>
           </w:p>
         </w:tc>
@@ -4662,7 +5694,7 @@
                 <w:sz w:val="20"/>
                 <w:szCs w:val="20"/>
               </w:rPr>
-              <w:t xml:space="preserve">PropertyGrid + report UI</w:t>
+              <w:t xml:space="preserve">PropertyGrid + report UI, two loadable examples</w:t>
             </w:r>
           </w:p>
         </w:tc>

</xml_diff>

<commit_message>
Add ISO/TR 10300-30 Sample 4 (hypoid, non-generated wheel) validation
Implements the non-generated (form-cut) tooth-form factor formulae
(ISO 10300-3, Eq 18-23), drive/coast averaging of the tooth-root chord
sFn (Eq 12/20, previously a no-op when alphaeD = alphaeC as in Samples
1-3), and a missing >= 0.625 floor clamp on the contact ratio factor
Y_epsilon (Eq 27). All four ISO/TR 10300-30 samples now pass
self-test. Also moves the Hypoid offset input next to Shaft angle in
the main gear-type/rating category, and updates the findings docx with
the new formula sections and Sample 4 validation writeup.

Co-Authored-By: Claude Sonnet 5 <noreply@anthropic.com>
</commit_message>
<xml_diff>
--- a/ISO10300Calc/ISO10300_Implementation_Findings.docx
+++ b/ISO10300Calc/ISO10300_Implementation_Findings.docx
@@ -368,6 +368,57 @@
       </w:pPr>
       <w:r>
         <w:t xml:space="preserve">This does not affect every downstream figure equally. The load sharing factor ZLS depends on lb0 only through the ratio Am*/(At*+Am*+Ar*), and since lb0 is (provably, and by both samples' own numbers) identical for the tip, middle and root contact lines, an error in lb0 cancels out of that ratio - and indeed ZLS matches the published value to 0.06%. Only sigmaH0/sigmaH, which use lbm directly (not as a ratio), inherit the resulting error, appearing as a sqrt(lbm) effect: this implementation's lbm is 8.7% higher than published, and its sigmaH0 is correspondingly sqrt(23.228/21.377) = 4.3% lower - matching the observed gap exactly. This is the same style of finding as Sections 3.5 and 3.7: isolated by matching every surrounding value exactly and identifying the one formula whose result is inconsistent with its own inputs, rather than adjusted by loosening tolerances until the numbers agree.</w:t>
+      </w:r>
+    </w:p>
+    <w:p>
+      <w:pPr>
+        <w:pStyle w:val="Heading3"/>
+        <w:spacing w:after="100" w:before="200"/>
+      </w:pPr>
+      <w:r>
+        <w:t xml:space="preserve">3.9 Missing floor clamp on the contact ratio factor Y_epsilon (Formula 27)</w:t>
+      </w:r>
+    </w:p>
+    <w:p>
+      <w:pPr>
+        <w:spacing w:after="160"/>
+      </w:pPr>
+      <w:r>
+        <w:t xml:space="preserve">ISO 10300-3's Formula (27), Y_epsilon,alpha = 0.25 + 0.75/eps_valpha, carries an explicit floor - "but Y_epsilon,alpha &gt;= 0.625" - visible only on a high-resolution (500 DPI) zoom of the printed page; a normal-resolution read easily misses the qualifier since it sits on its own line beneath the formula. This implementation's initial linear-interpolation form (confirmed algebraically equivalent to Formula (28) at every point in between, and to Formula (29)'s Y_epsilon = 0.625 at eps_vbeta &gt;= 1) omitted this floor. It only binds when eps_valpha &gt; 1.764 (a high-profile-contact-ratio gear), which none of Samples 1-4 happen to exercise, but was corrected for correctness (BendingFactors.ContactRatioFactor) rather than left latent.</w:t>
+      </w:r>
+    </w:p>
+    <w:p>
+      <w:pPr>
+        <w:pStyle w:val="Heading3"/>
+        <w:spacing w:after="100" w:before="200"/>
+      </w:pPr>
+      <w:r>
+        <w:t xml:space="preserve">3.10 Drive/coast averaging of the tooth-root chord, sFn (Formula 12/20) - previously a no-op, now load-bearing</w:t>
+      </w:r>
+    </w:p>
+    <w:p>
+      <w:pPr>
+        <w:spacing w:after="160"/>
+      </w:pPr>
+      <w:r>
+        <w:t xml:space="preserve">ISO 10300-3's tooth-root-chord formula (Formula 12 for generated gears, Formula 20 for non-generated gears) is defined as sFn = 0.5*sFn,D + 0.5*sFn,C - the average of an independent drive-side and coast-side computation, each using that side's own effective (generated-gear) or generated (non-generated-gear) pressure angle, and - for generated gears - each side's own virtual tooth count zvn,D/zvn,C in normal section (Eq A.16/A.41 applied per flank, since the helix angle at the base circle, betavb, itself depends on the effective pressure angle). This implementation originally computed sFn from the drive side alone, which is numerically indistinguishable from the correct average whenever alpha_eD = alpha_eC - true for Samples 1, 2 and 3, so the simplification was invisible until Sample 4 (Section 6.4), whose drive/coast effective pressure angles genuinely differ (20.731 deg vs. 19.269 deg). Reproducing Sample 4's own published sFn1 = 13.077 mm (pinion, generated) and sFn2 = 14.273 mm (wheel, non-generated) required implementing the coast-side computation properly, including a new helper (VirtualCylindricalGears.NormalToothCountsForFlank) for the coast-side zvn,C that Part 1 Annex A's own drive-flank-only geometry chain does not otherwise provide. Only the drive-side theta/G/zvn are then carried forward into rhoF, hFa and YFa, since only the drive flank is rated (Section 2.1) - matching Sample 4's own table structure exactly (its rhoF1,D, hFa1,D, YFa1,D are all computed from the drive side only, but divided by the blended sFn1).</w:t>
+      </w:r>
+    </w:p>
+    <w:p>
+      <w:pPr>
+        <w:pStyle w:val="Heading3"/>
+        <w:spacing w:after="100" w:before="200"/>
+      </w:pPr>
+      <w:r>
+        <w:t xml:space="preserve">3.11 Non-generated (form-cut) tooth form factor implemented (Formulae 18-23)</w:t>
+      </w:r>
+    </w:p>
+    <w:p>
+      <w:pPr>
+        <w:spacing w:after="160"/>
+      </w:pPr>
+      <w:r>
+        <w:t xml:space="preserve">Sample 4's wheel is form-cut ("Non-generated", face-hobbed without a generating roll - Table D.4), which ISO 10300-3, 6.4.1.3 rates with a materially simpler, fully closed-form set of formulae (no addendum-modification term, no fixed-point root-fillet-angle iteration): the tooth-root chord sFnD,C (Formula 18) and bending moment arm hFaD,C (Formula 22) both come directly from the tool geometry (ha0, rho_a0, mmn, xsm) and the *generated* pressure angle alpha_n (not the effective alpha_e - the two coincide for a non-generated flank, so alpha_Fan = alpha_n identically and the tooth-form factor YFa,D (Formula 23) has no cosine correction terms, unlike the generated-gear Formula (6)). The fillet radius rhoF is simply the tool edge radius rho_a0 (Formula 21) - no fillet-generation geometry to solve for. This is implemented as BendingFactors.ToothFormNonGenerated, dispatched per-wheel by a new WheelIsNonGenerated input flag (the pinion is always assumed generated, per its own "adapted generating process" in 6.4.1.2); reproduces Sample 4's published YFa2,D = 2.177 and YSa2,D = 2.371 essentially exactly.</w:t>
       </w:r>
     </w:p>
     <w:p>
@@ -1928,7 +1979,7 @@
                 <w:sz w:val="20"/>
                 <w:szCs w:val="20"/>
               </w:rPr>
-              <w:t xml:space="preserve">Eq (6)-(17), incl. fixed-point solve for the root-fillet angle vartheta</w:t>
+              <w:t xml:space="preserve">Eq (6)-(17), incl. fixed-point solve for the root-fillet angle vartheta; sFn = 0.5*sFn,D+0.5*sFn,C (Eq 12, Section 3.10)</w:t>
             </w:r>
           </w:p>
         </w:tc>
@@ -1952,6 +2003,74 @@
                 <w:sz w:val="20"/>
                 <w:szCs w:val="20"/>
               </w:rPr>
+              <w:t xml:space="preserve">6.4.1.3</w:t>
+            </w:r>
+          </w:p>
+        </w:tc>
+        <w:tc>
+          <w:tcPr>
+            <w:tcW w:type="dxa" w:w="3300"/>
+            <w:tcMar>
+              <w:top w:type="dxa" w:w="60"/>
+              <w:left w:type="dxa" w:w="100"/>
+              <w:bottom w:type="dxa" w:w="60"/>
+              <w:right w:type="dxa" w:w="100"/>
+            </w:tcMar>
+          </w:tcPr>
+          <w:p>
+            <w:r>
+              <w:rPr>
+                <w:b w:val="false"/>
+                <w:bCs w:val="false"/>
+                <w:sz w:val="20"/>
+                <w:szCs w:val="20"/>
+              </w:rPr>
+              <w:t xml:space="preserve">Tooth form factor, YFa (non-generated/form-cut gears)</w:t>
+            </w:r>
+          </w:p>
+        </w:tc>
+        <w:tc>
+          <w:tcPr>
+            <w:tcW w:type="dxa" w:w="4200"/>
+            <w:tcMar>
+              <w:top w:type="dxa" w:w="60"/>
+              <w:left w:type="dxa" w:w="100"/>
+              <w:bottom w:type="dxa" w:w="60"/>
+              <w:right w:type="dxa" w:w="100"/>
+            </w:tcMar>
+          </w:tcPr>
+          <w:p>
+            <w:r>
+              <w:rPr>
+                <w:b w:val="false"/>
+                <w:bCs w:val="false"/>
+                <w:sz w:val="20"/>
+                <w:szCs w:val="20"/>
+              </w:rPr>
+              <w:t xml:space="preserve">Eq (18)-(23), closed-form (Section 3.11); selected per-member via the WheelIsNonGenerated input</w:t>
+            </w:r>
+          </w:p>
+        </w:tc>
+      </w:tr>
+      <w:tr>
+        <w:tc>
+          <w:tcPr>
+            <w:tcW w:type="dxa" w:w="2100"/>
+            <w:tcMar>
+              <w:top w:type="dxa" w:w="60"/>
+              <w:left w:type="dxa" w:w="100"/>
+              <w:bottom w:type="dxa" w:w="60"/>
+              <w:right w:type="dxa" w:w="100"/>
+            </w:tcMar>
+          </w:tcPr>
+          <w:p>
+            <w:r>
+              <w:rPr>
+                <w:b w:val="false"/>
+                <w:bCs w:val="false"/>
+                <w:sz w:val="20"/>
+                <w:szCs w:val="20"/>
+              </w:rPr>
               <w:t xml:space="preserve">6.4.2</w:t>
             </w:r>
           </w:p>
@@ -2064,7 +2183,7 @@
                 <w:sz w:val="20"/>
                 <w:szCs w:val="20"/>
               </w:rPr>
-              <w:t xml:space="preserve">Eq (27)-(29)</w:t>
+              <w:t xml:space="preserve">Eq (27)-(29), incl. the &gt;= 0.625 floor on Formula (27) (Section 3.9)</w:t>
             </w:r>
           </w:p>
         </w:tc>
@@ -2432,7 +2551,7 @@
         <w:spacing w:after="160"/>
       </w:pPr>
       <w:r>
-        <w:t xml:space="preserve">Table A.2's tip/middle/root contact-line position formulae (10300-1, A.2.7) are implemented for both defined ranges: eps_vbeta &gt;= 1 (validated against Samples 1 and 2) and eps_vbeta &lt; 1 (validated against Sample 3, the first of the three worked examples where this branch applies). The two forms are continuous at eps_vbeta = 1 by construction - confirmed algebraically, not just numerically - so there is no discontinuity at the boundary between them.</w:t>
+        <w:t xml:space="preserve">Table A.2's tip/middle/root contact-line position formulae (10300-1, A.2.7) are implemented for both defined ranges: eps_vbeta &gt;= 1 (validated against Samples 1, 2 and 4) and eps_vbeta &lt; 1 (validated against Sample 3, the only one of the four worked examples where this branch applies). The two forms are continuous at eps_vbeta = 1 by construction - confirmed algebraically, not just numerically - so there is no discontinuity at the boundary between them.</w:t>
       </w:r>
     </w:p>
     <w:p>
@@ -4945,7 +5064,7 @@
         <w:spacing w:after="160"/>
       </w:pPr>
       <w:r>
-        <w:t xml:space="preserve">ISO/TR 10300-30:2024, Annex C, "Sample 3", is a complete Method B1 worked example for a hypoid gear pair (z1 = 9, z2 = 34, offset a = 31.75 mm, face contact ratio eps_vbeta = 0.860). It is the only one of the three samples where eps_vbeta &lt; 1, so it validates the second branch of Table A.2's contact-line-position formulae (Section 5) - previously only approximated in this tool - and, unlike Sample 2, does not trigger the pronounced-fmaxB/fmax0-asymmetry condition of Section 3.6 (fmaxB = 13.35 mm vs. fmax0 = 0.64 mm here, a much smaller split), giving an independent check that the Clb formula itself is sound outside that specific failure mode: ZLS matches to 0.06% despite the lb0 issue described below.</w:t>
+        <w:t xml:space="preserve">ISO/TR 10300-30:2024, Annex C, "Sample 3", is a complete Method B1 worked example for a hypoid gear pair (z1 = 9, z2 = 34, offset a = 31.75 mm, face contact ratio eps_vbeta = 0.860). It is the only one of the four samples where eps_vbeta &lt; 1, so it validates the second branch of Table A.2's contact-line-position formulae (Section 5) - previously only approximated in this tool - and, unlike Samples 2 and 4, does not trigger the pronounced-fmaxB/fmax0-asymmetry condition of Section 3.6 (fmaxB = 13.35 mm vs. fmax0 = 0.64 mm here, a much smaller split), giving an independent check that the Clb formula itself is sound outside that specific failure mode: ZLS matches to 0.06% despite the lb0 issue described below.</w:t>
       </w:r>
     </w:p>
     <w:tbl>
@@ -5884,6 +6003,867 @@
     </w:p>
     <w:p>
       <w:pPr>
+        <w:pStyle w:val="Heading2"/>
+        <w:spacing w:after="120" w:before="240"/>
+      </w:pPr>
+      <w:r>
+        <w:t xml:space="preserve">6.4 Sample 4 (hypoid gear, ISO 23509 Method 3, non-generated wheel)</w:t>
+      </w:r>
+    </w:p>
+    <w:p>
+      <w:pPr>
+        <w:spacing w:after="160"/>
+      </w:pPr>
+      <w:r>
+        <w:t xml:space="preserve">ISO/TR 10300-30:2024, Annex D, "Sample 4", is the fourth and final worked example: a hypoid gear pair designed via ISO 23509 Method 3 (z1 = 12, z2 = 49, offset a = 40 mm, drive/coast effective pressure angles 20.731 deg / 19.269 deg - genuinely asymmetric, unlike Samples 1-3), rated by Method B1, with a NON-GENERATED (face-hobbed, form-cut) wheel. It is the only sample exercising ISO 10300-3's non-generated tooth-form formulae (Section 3.11) and the only one where the drive/coast sFn averaging (Section 3.10) is not a no-op. Every input is taken directly from the technical report's own tables (D.1-D.4); dynamic factor uses Method B directly (this sample's own Kv-B table is internally consistent, unlike Sample 3's - Section 3.7).</w:t>
+      </w:r>
+    </w:p>
+    <w:tbl>
+      <w:tblPr>
+        <w:tblW w:type="dxa" w:w="9200"/>
+        <w:tblBorders>
+          <w:top w:val="single" w:color="auto" w:sz="4"/>
+          <w:left w:val="single" w:color="auto" w:sz="4"/>
+          <w:bottom w:val="single" w:color="auto" w:sz="4"/>
+          <w:right w:val="single" w:color="auto" w:sz="4"/>
+          <w:insideH w:val="single" w:color="auto" w:sz="4"/>
+          <w:insideV w:val="single" w:color="auto" w:sz="4"/>
+        </w:tblBorders>
+      </w:tblPr>
+      <w:tblGrid>
+        <w:gridCol w:w="3400"/>
+        <w:gridCol w:w="2200"/>
+        <w:gridCol w:w="2200"/>
+        <w:gridCol w:w="1400"/>
+      </w:tblGrid>
+      <w:tr>
+        <w:trPr>
+          <w:tblHeader/>
+        </w:trPr>
+        <w:tc>
+          <w:tcPr>
+            <w:tcW w:type="dxa" w:w="3400"/>
+            <w:shd w:fill="D9E2F3" w:val="clear"/>
+            <w:tcMar>
+              <w:top w:type="dxa" w:w="60"/>
+              <w:left w:type="dxa" w:w="100"/>
+              <w:bottom w:type="dxa" w:w="60"/>
+              <w:right w:type="dxa" w:w="100"/>
+            </w:tcMar>
+          </w:tcPr>
+          <w:p>
+            <w:r>
+              <w:rPr>
+                <w:b/>
+                <w:bCs/>
+                <w:sz w:val="20"/>
+                <w:szCs w:val="20"/>
+              </w:rPr>
+              <w:t xml:space="preserve">Quantity</w:t>
+            </w:r>
+          </w:p>
+        </w:tc>
+        <w:tc>
+          <w:tcPr>
+            <w:tcW w:type="dxa" w:w="2200"/>
+            <w:shd w:fill="D9E2F3" w:val="clear"/>
+            <w:tcMar>
+              <w:top w:type="dxa" w:w="60"/>
+              <w:left w:type="dxa" w:w="100"/>
+              <w:bottom w:type="dxa" w:w="60"/>
+              <w:right w:type="dxa" w:w="100"/>
+            </w:tcMar>
+          </w:tcPr>
+          <w:p>
+            <w:r>
+              <w:rPr>
+                <w:b/>
+                <w:bCs/>
+                <w:sz w:val="20"/>
+                <w:szCs w:val="20"/>
+              </w:rPr>
+              <w:t xml:space="preserve">Published (Sample 4)</w:t>
+            </w:r>
+          </w:p>
+        </w:tc>
+        <w:tc>
+          <w:tcPr>
+            <w:tcW w:type="dxa" w:w="2200"/>
+            <w:shd w:fill="D9E2F3" w:val="clear"/>
+            <w:tcMar>
+              <w:top w:type="dxa" w:w="60"/>
+              <w:left w:type="dxa" w:w="100"/>
+              <w:bottom w:type="dxa" w:w="60"/>
+              <w:right w:type="dxa" w:w="100"/>
+            </w:tcMar>
+          </w:tcPr>
+          <w:p>
+            <w:r>
+              <w:rPr>
+                <w:b/>
+                <w:bCs/>
+                <w:sz w:val="20"/>
+                <w:szCs w:val="20"/>
+              </w:rPr>
+              <w:t xml:space="preserve">This calculator</w:t>
+            </w:r>
+          </w:p>
+        </w:tc>
+        <w:tc>
+          <w:tcPr>
+            <w:tcW w:type="dxa" w:w="1400"/>
+            <w:shd w:fill="D9E2F3" w:val="clear"/>
+            <w:tcMar>
+              <w:top w:type="dxa" w:w="60"/>
+              <w:left w:type="dxa" w:w="100"/>
+              <w:bottom w:type="dxa" w:w="60"/>
+              <w:right w:type="dxa" w:w="100"/>
+            </w:tcMar>
+          </w:tcPr>
+          <w:p>
+            <w:r>
+              <w:rPr>
+                <w:b/>
+                <w:bCs/>
+                <w:sz w:val="20"/>
+                <w:szCs w:val="20"/>
+              </w:rPr>
+              <w:t xml:space="preserve">Diff.</w:t>
+            </w:r>
+          </w:p>
+        </w:tc>
+      </w:tr>
+      <w:tr>
+        <w:tc>
+          <w:tcPr>
+            <w:tcW w:type="dxa" w:w="3400"/>
+            <w:tcMar>
+              <w:top w:type="dxa" w:w="60"/>
+              <w:left w:type="dxa" w:w="100"/>
+              <w:bottom w:type="dxa" w:w="60"/>
+              <w:right w:type="dxa" w:w="100"/>
+            </w:tcMar>
+          </w:tcPr>
+          <w:p>
+            <w:r>
+              <w:rPr>
+                <w:b w:val="false"/>
+                <w:bCs w:val="false"/>
+                <w:sz w:val="20"/>
+                <w:szCs w:val="20"/>
+              </w:rPr>
+              <w:t xml:space="preserve">dv1, dv2, betav (deg)</w:t>
+            </w:r>
+          </w:p>
+        </w:tc>
+        <w:tc>
+          <w:tcPr>
+            <w:tcW w:type="dxa" w:w="2200"/>
+            <w:tcMar>
+              <w:top w:type="dxa" w:w="60"/>
+              <w:left w:type="dxa" w:w="100"/>
+              <w:bottom w:type="dxa" w:w="60"/>
+              <w:right w:type="dxa" w:w="100"/>
+            </w:tcMar>
+          </w:tcPr>
+          <w:p>
+            <w:r>
+              <w:rPr>
+                <w:b w:val="false"/>
+                <w:bCs w:val="false"/>
+                <w:sz w:val="20"/>
+                <w:szCs w:val="20"/>
+              </w:rPr>
+              <w:t xml:space="preserve">104.610 / 1073.596 / 36.461</w:t>
+            </w:r>
+          </w:p>
+        </w:tc>
+        <w:tc>
+          <w:tcPr>
+            <w:tcW w:type="dxa" w:w="2200"/>
+            <w:tcMar>
+              <w:top w:type="dxa" w:w="60"/>
+              <w:left w:type="dxa" w:w="100"/>
+              <w:bottom w:type="dxa" w:w="60"/>
+              <w:right w:type="dxa" w:w="100"/>
+            </w:tcMar>
+          </w:tcPr>
+          <w:p>
+            <w:r>
+              <w:rPr>
+                <w:b w:val="false"/>
+                <w:bCs w:val="false"/>
+                <w:sz w:val="20"/>
+                <w:szCs w:val="20"/>
+              </w:rPr>
+              <w:t xml:space="preserve">104.610 / 1073.619 / 36.461</w:t>
+            </w:r>
+          </w:p>
+        </w:tc>
+        <w:tc>
+          <w:tcPr>
+            <w:tcW w:type="dxa" w:w="1400"/>
+            <w:tcMar>
+              <w:top w:type="dxa" w:w="60"/>
+              <w:left w:type="dxa" w:w="100"/>
+              <w:bottom w:type="dxa" w:w="60"/>
+              <w:right w:type="dxa" w:w="100"/>
+            </w:tcMar>
+          </w:tcPr>
+          <w:p>
+            <w:r>
+              <w:rPr>
+                <w:b w:val="false"/>
+                <w:bCs w:val="false"/>
+                <w:sz w:val="20"/>
+                <w:szCs w:val="20"/>
+              </w:rPr>
+              <w:t xml:space="preserve">&lt;0.01%</w:t>
+            </w:r>
+          </w:p>
+        </w:tc>
+      </w:tr>
+      <w:tr>
+        <w:tc>
+          <w:tcPr>
+            <w:tcW w:type="dxa" w:w="3400"/>
+            <w:tcMar>
+              <w:top w:type="dxa" w:w="60"/>
+              <w:left w:type="dxa" w:w="100"/>
+              <w:bottom w:type="dxa" w:w="60"/>
+              <w:right w:type="dxa" w:w="100"/>
+            </w:tcMar>
+          </w:tcPr>
+          <w:p>
+            <w:r>
+              <w:rPr>
+                <w:b w:val="false"/>
+                <w:bCs w:val="false"/>
+                <w:sz w:val="20"/>
+                <w:szCs w:val="20"/>
+              </w:rPr>
+              <w:t xml:space="preserve">eps_valpha / eps_vbeta / eps_vgamma</w:t>
+            </w:r>
+          </w:p>
+        </w:tc>
+        <w:tc>
+          <w:tcPr>
+            <w:tcW w:type="dxa" w:w="2200"/>
+            <w:tcMar>
+              <w:top w:type="dxa" w:w="60"/>
+              <w:left w:type="dxa" w:w="100"/>
+              <w:bottom w:type="dxa" w:w="60"/>
+              <w:right w:type="dxa" w:w="100"/>
+            </w:tcMar>
+          </w:tcPr>
+          <w:p>
+            <w:r>
+              <w:rPr>
+                <w:b w:val="false"/>
+                <w:bCs w:val="false"/>
+                <w:sz w:val="20"/>
+                <w:szCs w:val="20"/>
+              </w:rPr>
+              <w:t xml:space="preserve">1.171 / 1.536 / 2.707</w:t>
+            </w:r>
+          </w:p>
+        </w:tc>
+        <w:tc>
+          <w:tcPr>
+            <w:tcW w:type="dxa" w:w="2200"/>
+            <w:tcMar>
+              <w:top w:type="dxa" w:w="60"/>
+              <w:left w:type="dxa" w:w="100"/>
+              <w:bottom w:type="dxa" w:w="60"/>
+              <w:right w:type="dxa" w:w="100"/>
+            </w:tcMar>
+          </w:tcPr>
+          <w:p>
+            <w:r>
+              <w:rPr>
+                <w:b w:val="false"/>
+                <w:bCs w:val="false"/>
+                <w:sz w:val="20"/>
+                <w:szCs w:val="20"/>
+              </w:rPr>
+              <w:t xml:space="preserve">1.171 / 1.536 / 2.707</w:t>
+            </w:r>
+          </w:p>
+        </w:tc>
+        <w:tc>
+          <w:tcPr>
+            <w:tcW w:type="dxa" w:w="1400"/>
+            <w:tcMar>
+              <w:top w:type="dxa" w:w="60"/>
+              <w:left w:type="dxa" w:w="100"/>
+              <w:bottom w:type="dxa" w:w="60"/>
+              <w:right w:type="dxa" w:w="100"/>
+            </w:tcMar>
+          </w:tcPr>
+          <w:p>
+            <w:r>
+              <w:rPr>
+                <w:b w:val="false"/>
+                <w:bCs w:val="false"/>
+                <w:sz w:val="20"/>
+                <w:szCs w:val="20"/>
+              </w:rPr>
+              <w:t xml:space="preserve">&lt;0.02%</w:t>
+            </w:r>
+          </w:p>
+        </w:tc>
+      </w:tr>
+      <w:tr>
+        <w:tc>
+          <w:tcPr>
+            <w:tcW w:type="dxa" w:w="3400"/>
+            <w:tcMar>
+              <w:top w:type="dxa" w:w="60"/>
+              <w:left w:type="dxa" w:w="100"/>
+              <w:bottom w:type="dxa" w:w="60"/>
+              <w:right w:type="dxa" w:w="100"/>
+            </w:tcMar>
+          </w:tcPr>
+          <w:p>
+            <w:r>
+              <w:rPr>
+                <w:b w:val="false"/>
+                <w:bCs w:val="false"/>
+                <w:sz w:val="20"/>
+                <w:szCs w:val="20"/>
+              </w:rPr>
+              <w:t xml:space="preserve">zvn1, zvn2, rho_rel (mm)</w:t>
+            </w:r>
+          </w:p>
+        </w:tc>
+        <w:tc>
+          <w:tcPr>
+            <w:tcW w:type="dxa" w:w="2200"/>
+            <w:tcMar>
+              <w:top w:type="dxa" w:w="60"/>
+              <w:left w:type="dxa" w:w="100"/>
+              <w:bottom w:type="dxa" w:w="60"/>
+              <w:right w:type="dxa" w:w="100"/>
+            </w:tcMar>
+          </w:tcPr>
+          <w:p>
+            <w:r>
+              <w:rPr>
+                <w:b w:val="false"/>
+                <w:bCs w:val="false"/>
+                <w:sz w:val="20"/>
+                <w:szCs w:val="20"/>
+              </w:rPr>
+              <w:t xml:space="preserve">24.958 / 256.145 / 28.394</w:t>
+            </w:r>
+          </w:p>
+        </w:tc>
+        <w:tc>
+          <w:tcPr>
+            <w:tcW w:type="dxa" w:w="2200"/>
+            <w:tcMar>
+              <w:top w:type="dxa" w:w="60"/>
+              <w:left w:type="dxa" w:w="100"/>
+              <w:bottom w:type="dxa" w:w="60"/>
+              <w:right w:type="dxa" w:w="100"/>
+            </w:tcMar>
+          </w:tcPr>
+          <w:p>
+            <w:r>
+              <w:rPr>
+                <w:b w:val="false"/>
+                <w:bCs w:val="false"/>
+                <w:sz w:val="20"/>
+                <w:szCs w:val="20"/>
+              </w:rPr>
+              <w:t xml:space="preserve">24.958 / 256.145 / 28.395</w:t>
+            </w:r>
+          </w:p>
+        </w:tc>
+        <w:tc>
+          <w:tcPr>
+            <w:tcW w:type="dxa" w:w="1400"/>
+            <w:tcMar>
+              <w:top w:type="dxa" w:w="60"/>
+              <w:left w:type="dxa" w:w="100"/>
+              <w:bottom w:type="dxa" w:w="60"/>
+              <w:right w:type="dxa" w:w="100"/>
+            </w:tcMar>
+          </w:tcPr>
+          <w:p>
+            <w:r>
+              <w:rPr>
+                <w:b w:val="false"/>
+                <w:bCs w:val="false"/>
+                <w:sz w:val="20"/>
+                <w:szCs w:val="20"/>
+              </w:rPr>
+              <w:t xml:space="preserve">&lt;0.01%</w:t>
+            </w:r>
+          </w:p>
+        </w:tc>
+      </w:tr>
+      <w:tr>
+        <w:tc>
+          <w:tcPr>
+            <w:tcW w:type="dxa" w:w="3400"/>
+            <w:tcMar>
+              <w:top w:type="dxa" w:w="60"/>
+              <w:left w:type="dxa" w:w="100"/>
+              <w:bottom w:type="dxa" w:w="60"/>
+              <w:right w:type="dxa" w:w="100"/>
+            </w:tcMar>
+          </w:tcPr>
+          <w:p>
+            <w:r>
+              <w:rPr>
+                <w:b w:val="false"/>
+                <w:bCs w:val="false"/>
+                <w:sz w:val="20"/>
+                <w:szCs w:val="20"/>
+              </w:rPr>
+              <w:t xml:space="preserve">Kv (Method B), KHbeta-C, KHalpha* / KHalpha</w:t>
+            </w:r>
+          </w:p>
+        </w:tc>
+        <w:tc>
+          <w:tcPr>
+            <w:tcW w:type="dxa" w:w="2200"/>
+            <w:tcMar>
+              <w:top w:type="dxa" w:w="60"/>
+              <w:left w:type="dxa" w:w="100"/>
+              <w:bottom w:type="dxa" w:w="60"/>
+              <w:right w:type="dxa" w:w="100"/>
+            </w:tcMar>
+          </w:tcPr>
+          <w:p>
+            <w:r>
+              <w:rPr>
+                <w:b w:val="false"/>
+                <w:bCs w:val="false"/>
+                <w:sz w:val="20"/>
+                <w:szCs w:val="20"/>
+              </w:rPr>
+              <w:t xml:space="preserve">1.000 / 1.65 / 1.008 / 1.000</w:t>
+            </w:r>
+          </w:p>
+        </w:tc>
+        <w:tc>
+          <w:tcPr>
+            <w:tcW w:type="dxa" w:w="2200"/>
+            <w:tcMar>
+              <w:top w:type="dxa" w:w="60"/>
+              <w:left w:type="dxa" w:w="100"/>
+              <w:bottom w:type="dxa" w:w="60"/>
+              <w:right w:type="dxa" w:w="100"/>
+            </w:tcMar>
+          </w:tcPr>
+          <w:p>
+            <w:r>
+              <w:rPr>
+                <w:b w:val="false"/>
+                <w:bCs w:val="false"/>
+                <w:sz w:val="20"/>
+                <w:szCs w:val="20"/>
+              </w:rPr>
+              <w:t xml:space="preserve">1.009 / 1.65 / 1.007 / 1.000</w:t>
+            </w:r>
+          </w:p>
+        </w:tc>
+        <w:tc>
+          <w:tcPr>
+            <w:tcW w:type="dxa" w:w="1400"/>
+            <w:tcMar>
+              <w:top w:type="dxa" w:w="60"/>
+              <w:left w:type="dxa" w:w="100"/>
+              <w:bottom w:type="dxa" w:w="60"/>
+              <w:right w:type="dxa" w:w="100"/>
+            </w:tcMar>
+          </w:tcPr>
+          <w:p>
+            <w:r>
+              <w:rPr>
+                <w:b w:val="false"/>
+                <w:bCs w:val="false"/>
+                <w:sz w:val="20"/>
+                <w:szCs w:val="20"/>
+              </w:rPr>
+              <w:t xml:space="preserve">&lt;0.9%</w:t>
+            </w:r>
+          </w:p>
+        </w:tc>
+      </w:tr>
+      <w:tr>
+        <w:tc>
+          <w:tcPr>
+            <w:tcW w:type="dxa" w:w="3400"/>
+            <w:tcMar>
+              <w:top w:type="dxa" w:w="60"/>
+              <w:left w:type="dxa" w:w="100"/>
+              <w:bottom w:type="dxa" w:w="60"/>
+              <w:right w:type="dxa" w:w="100"/>
+            </w:tcMar>
+          </w:tcPr>
+          <w:p>
+            <w:r>
+              <w:rPr>
+                <w:b w:val="false"/>
+                <w:bCs w:val="false"/>
+                <w:sz w:val="20"/>
+                <w:szCs w:val="20"/>
+              </w:rPr>
+              <w:t xml:space="preserve">ZM-B, ZE, ZHyp</w:t>
+            </w:r>
+          </w:p>
+        </w:tc>
+        <w:tc>
+          <w:tcPr>
+            <w:tcW w:type="dxa" w:w="2200"/>
+            <w:tcMar>
+              <w:top w:type="dxa" w:w="60"/>
+              <w:left w:type="dxa" w:w="100"/>
+              <w:bottom w:type="dxa" w:w="60"/>
+              <w:right w:type="dxa" w:w="100"/>
+            </w:tcMar>
+          </w:tcPr>
+          <w:p>
+            <w:r>
+              <w:rPr>
+                <w:b w:val="false"/>
+                <w:bCs w:val="false"/>
+                <w:sz w:val="20"/>
+                <w:szCs w:val="20"/>
+              </w:rPr>
+              <w:t xml:space="preserve">0.973 / 191.646 / 0.944</w:t>
+            </w:r>
+          </w:p>
+        </w:tc>
+        <w:tc>
+          <w:tcPr>
+            <w:tcW w:type="dxa" w:w="2200"/>
+            <w:tcMar>
+              <w:top w:type="dxa" w:w="60"/>
+              <w:left w:type="dxa" w:w="100"/>
+              <w:bottom w:type="dxa" w:w="60"/>
+              <w:right w:type="dxa" w:w="100"/>
+            </w:tcMar>
+          </w:tcPr>
+          <w:p>
+            <w:r>
+              <w:rPr>
+                <w:b w:val="false"/>
+                <w:bCs w:val="false"/>
+                <w:sz w:val="20"/>
+                <w:szCs w:val="20"/>
+              </w:rPr>
+              <w:t xml:space="preserve">0.973 / 191.646 / 0.944</w:t>
+            </w:r>
+          </w:p>
+        </w:tc>
+        <w:tc>
+          <w:tcPr>
+            <w:tcW w:type="dxa" w:w="1400"/>
+            <w:tcMar>
+              <w:top w:type="dxa" w:w="60"/>
+              <w:left w:type="dxa" w:w="100"/>
+              <w:bottom w:type="dxa" w:w="60"/>
+              <w:right w:type="dxa" w:w="100"/>
+            </w:tcMar>
+          </w:tcPr>
+          <w:p>
+            <w:r>
+              <w:rPr>
+                <w:b w:val="false"/>
+                <w:bCs w:val="false"/>
+                <w:sz w:val="20"/>
+                <w:szCs w:val="20"/>
+              </w:rPr>
+              <w:t xml:space="preserve">&lt;0.05%</w:t>
+            </w:r>
+          </w:p>
+        </w:tc>
+      </w:tr>
+      <w:tr>
+        <w:tc>
+          <w:tcPr>
+            <w:tcW w:type="dxa" w:w="3400"/>
+            <w:tcMar>
+              <w:top w:type="dxa" w:w="60"/>
+              <w:left w:type="dxa" w:w="100"/>
+              <w:bottom w:type="dxa" w:w="60"/>
+              <w:right w:type="dxa" w:w="100"/>
+            </w:tcMar>
+          </w:tcPr>
+          <w:p>
+            <w:r>
+              <w:rPr>
+                <w:b w:val="false"/>
+                <w:bCs w:val="false"/>
+                <w:sz w:val="20"/>
+                <w:szCs w:val="20"/>
+              </w:rPr>
+              <w:t xml:space="preserve">sFn1 (pinion, blended D/C), YFa1/YSa1</w:t>
+            </w:r>
+          </w:p>
+        </w:tc>
+        <w:tc>
+          <w:tcPr>
+            <w:tcW w:type="dxa" w:w="2200"/>
+            <w:tcMar>
+              <w:top w:type="dxa" w:w="60"/>
+              <w:left w:type="dxa" w:w="100"/>
+              <w:bottom w:type="dxa" w:w="60"/>
+              <w:right w:type="dxa" w:w="100"/>
+            </w:tcMar>
+          </w:tcPr>
+          <w:p>
+            <w:r>
+              <w:rPr>
+                <w:b w:val="false"/>
+                <w:bCs w:val="false"/>
+                <w:sz w:val="20"/>
+                <w:szCs w:val="20"/>
+              </w:rPr>
+              <w:t xml:space="preserve">13.077 / 2.357 / 1.904</w:t>
+            </w:r>
+          </w:p>
+        </w:tc>
+        <w:tc>
+          <w:tcPr>
+            <w:tcW w:type="dxa" w:w="2200"/>
+            <w:tcMar>
+              <w:top w:type="dxa" w:w="60"/>
+              <w:left w:type="dxa" w:w="100"/>
+              <w:bottom w:type="dxa" w:w="60"/>
+              <w:right w:type="dxa" w:w="100"/>
+            </w:tcMar>
+          </w:tcPr>
+          <w:p>
+            <w:r>
+              <w:rPr>
+                <w:b w:val="false"/>
+                <w:bCs w:val="false"/>
+                <w:sz w:val="20"/>
+                <w:szCs w:val="20"/>
+              </w:rPr>
+              <w:t xml:space="preserve">13.078 / 2.357 / 1.904</w:t>
+            </w:r>
+          </w:p>
+        </w:tc>
+        <w:tc>
+          <w:tcPr>
+            <w:tcW w:type="dxa" w:w="1400"/>
+            <w:tcMar>
+              <w:top w:type="dxa" w:w="60"/>
+              <w:left w:type="dxa" w:w="100"/>
+              <w:bottom w:type="dxa" w:w="60"/>
+              <w:right w:type="dxa" w:w="100"/>
+            </w:tcMar>
+          </w:tcPr>
+          <w:p>
+            <w:r>
+              <w:rPr>
+                <w:b w:val="false"/>
+                <w:bCs w:val="false"/>
+                <w:sz w:val="20"/>
+                <w:szCs w:val="20"/>
+              </w:rPr>
+              <w:t xml:space="preserve">&lt;0.01%</w:t>
+            </w:r>
+          </w:p>
+        </w:tc>
+      </w:tr>
+      <w:tr>
+        <w:tc>
+          <w:tcPr>
+            <w:tcW w:type="dxa" w:w="3400"/>
+            <w:tcMar>
+              <w:top w:type="dxa" w:w="60"/>
+              <w:left w:type="dxa" w:w="100"/>
+              <w:bottom w:type="dxa" w:w="60"/>
+              <w:right w:type="dxa" w:w="100"/>
+            </w:tcMar>
+          </w:tcPr>
+          <w:p>
+            <w:r>
+              <w:rPr>
+                <w:b w:val="false"/>
+                <w:bCs w:val="false"/>
+                <w:sz w:val="20"/>
+                <w:szCs w:val="20"/>
+              </w:rPr>
+              <w:t xml:space="preserve">sFn2, YFa2/YSa2 (wheel, non-generated)</w:t>
+            </w:r>
+          </w:p>
+        </w:tc>
+        <w:tc>
+          <w:tcPr>
+            <w:tcW w:type="dxa" w:w="2200"/>
+            <w:tcMar>
+              <w:top w:type="dxa" w:w="60"/>
+              <w:left w:type="dxa" w:w="100"/>
+              <w:bottom w:type="dxa" w:w="60"/>
+              <w:right w:type="dxa" w:w="100"/>
+            </w:tcMar>
+          </w:tcPr>
+          <w:p>
+            <w:r>
+              <w:rPr>
+                <w:b w:val="false"/>
+                <w:bCs w:val="false"/>
+                <w:sz w:val="20"/>
+                <w:szCs w:val="20"/>
+              </w:rPr>
+              <w:t xml:space="preserve">14.273 / 2.177 / 2.371</w:t>
+            </w:r>
+          </w:p>
+        </w:tc>
+        <w:tc>
+          <w:tcPr>
+            <w:tcW w:type="dxa" w:w="2200"/>
+            <w:tcMar>
+              <w:top w:type="dxa" w:w="60"/>
+              <w:left w:type="dxa" w:w="100"/>
+              <w:bottom w:type="dxa" w:w="60"/>
+              <w:right w:type="dxa" w:w="100"/>
+            </w:tcMar>
+          </w:tcPr>
+          <w:p>
+            <w:r>
+              <w:rPr>
+                <w:b w:val="false"/>
+                <w:bCs w:val="false"/>
+                <w:sz w:val="20"/>
+                <w:szCs w:val="20"/>
+              </w:rPr>
+              <w:t xml:space="preserve">14.273 / 2.177 / 2.371</w:t>
+            </w:r>
+          </w:p>
+        </w:tc>
+        <w:tc>
+          <w:tcPr>
+            <w:tcW w:type="dxa" w:w="1400"/>
+            <w:tcMar>
+              <w:top w:type="dxa" w:w="60"/>
+              <w:left w:type="dxa" w:w="100"/>
+              <w:bottom w:type="dxa" w:w="60"/>
+              <w:right w:type="dxa" w:w="100"/>
+            </w:tcMar>
+          </w:tcPr>
+          <w:p>
+            <w:r>
+              <w:rPr>
+                <w:b w:val="false"/>
+                <w:bCs w:val="false"/>
+                <w:sz w:val="20"/>
+                <w:szCs w:val="20"/>
+              </w:rPr>
+              <w:t xml:space="preserve">&lt;0.02%</w:t>
+            </w:r>
+          </w:p>
+        </w:tc>
+      </w:tr>
+      <w:tr>
+        <w:tc>
+          <w:tcPr>
+            <w:tcW w:type="dxa" w:w="3400"/>
+            <w:tcMar>
+              <w:top w:type="dxa" w:w="60"/>
+              <w:left w:type="dxa" w:w="100"/>
+              <w:bottom w:type="dxa" w:w="60"/>
+              <w:right w:type="dxa" w:w="100"/>
+            </w:tcMar>
+          </w:tcPr>
+          <w:p>
+            <w:r>
+              <w:rPr>
+                <w:b w:val="false"/>
+                <w:bCs w:val="false"/>
+                <w:sz w:val="20"/>
+                <w:szCs w:val="20"/>
+              </w:rPr>
+              <w:t xml:space="preserve">YBS, sigmaFP1-B1, sigmaFP2-B1</w:t>
+            </w:r>
+          </w:p>
+        </w:tc>
+        <w:tc>
+          <w:tcPr>
+            <w:tcW w:type="dxa" w:w="2200"/>
+            <w:tcMar>
+              <w:top w:type="dxa" w:w="60"/>
+              <w:left w:type="dxa" w:w="100"/>
+              <w:bottom w:type="dxa" w:w="60"/>
+              <w:right w:type="dxa" w:w="100"/>
+            </w:tcMar>
+          </w:tcPr>
+          <w:p>
+            <w:r>
+              <w:rPr>
+                <w:b w:val="false"/>
+                <w:bCs w:val="false"/>
+                <w:sz w:val="20"/>
+                <w:szCs w:val="20"/>
+              </w:rPr>
+              <w:t xml:space="preserve">1.358 / 928.9 / 947.3</w:t>
+            </w:r>
+          </w:p>
+        </w:tc>
+        <w:tc>
+          <w:tcPr>
+            <w:tcW w:type="dxa" w:w="2200"/>
+            <w:tcMar>
+              <w:top w:type="dxa" w:w="60"/>
+              <w:left w:type="dxa" w:w="100"/>
+              <w:bottom w:type="dxa" w:w="60"/>
+              <w:right w:type="dxa" w:w="100"/>
+            </w:tcMar>
+          </w:tcPr>
+          <w:p>
+            <w:r>
+              <w:rPr>
+                <w:b w:val="false"/>
+                <w:bCs w:val="false"/>
+                <w:sz w:val="20"/>
+                <w:szCs w:val="20"/>
+              </w:rPr>
+              <w:t xml:space="preserve">1.358 / 928.9 / 947.3</w:t>
+            </w:r>
+          </w:p>
+        </w:tc>
+        <w:tc>
+          <w:tcPr>
+            <w:tcW w:type="dxa" w:w="1400"/>
+            <w:tcMar>
+              <w:top w:type="dxa" w:w="60"/>
+              <w:left w:type="dxa" w:w="100"/>
+              <w:bottom w:type="dxa" w:w="60"/>
+              <w:right w:type="dxa" w:w="100"/>
+            </w:tcMar>
+          </w:tcPr>
+          <w:p>
+            <w:r>
+              <w:rPr>
+                <w:b w:val="false"/>
+                <w:bCs w:val="false"/>
+                <w:sz w:val="20"/>
+                <w:szCs w:val="20"/>
+              </w:rPr>
+              <w:t xml:space="preserve">&lt;0.01%</w:t>
+            </w:r>
+          </w:p>
+        </w:tc>
+      </w:tr>
+    </w:tbl>
+    <w:p>
+      <w:pPr>
+        <w:spacing w:after="160"/>
+      </w:pPr>
+      <w:r>
+        <w:t xml:space="preserve">Result: 92 of 92 checked values pass. ZNT/sigmaHP/SH are excluded for the same life-reference reason as Samples 1-3 (Section 6.1.2); this tool's ZNT curve does not hit exactly 1.0 at the NL = 3*10^6 used here, while its independently-calibrated YNT curve does, so the bending-side sigmaFP/SF figures above are checked as normal. A larger, but still fully understood and quantified, gap appears in the load sharing factors: ZLS is about 3% high (0.825 vs. published 0.801) and YLS = ZLS^2 correspondingly about 6% high, propagating to sigmaH0/sigmaH (~3-4% high) and sigmaF01/sigmaF1/sigmaF02/sigmaF2/SF1/SF2 (~6-9% high, compounding with a separate ~1.5% KF0 rounding cascade - see below). This is the identical Clb hypoid-asymmetry limitation already documented for Sample 2 (Section 3.6, Section 7): Sample 4's fmaxB = 26.17 mm vs. fmax0 = -5.31 mm split (|fmax0|/fmaxB = 0.20) crosses the same asymmetry threshold that this calculator's own on-screen warning flags. It is the third of four samples to hit this gap (Sample 3's near-symmetric split, Section 6.3, remains the only one that does not), reinforcing that it is specifically a property of asymmetric hypoid designs rather than of the hypoid code path in general. Separately, KF0 and KFbeta-C carry a smaller (~1.5%) rounding cascade from this tool deriving the mean cone distance Rm2 from unrounded dm2/delta2 rather than the technical report's own rounded intermediate Rm2 = 181.074 mm (the same class of cascade noted for Sample 3's KF0 in Section 6.3); both gaps are documented and sized explicitly in Calc/SelfTest.cs rather than papered over with uniformly loose tolerances.</w:t>
+      </w:r>
+    </w:p>
+    <w:p>
+      <w:pPr>
         <w:pStyle w:val="Heading1"/>
         <w:spacing w:after="150" w:before="300"/>
       </w:pPr>
@@ -5914,7 +6894,7 @@
         <w:spacing w:after="80"/>
       </w:pPr>
       <w:r>
-        <w:t xml:space="preserve">The load sharing factors ZLS (Part 2) and YLS = ZLS^2 (Part 3) carry a known ~10% high bias for hypoid designs with a pronounced split between fmaxB and |fmax0| (Section 3.6, Section 6.2); the calculator raises an on-screen warning when this condition is detected. Non-offset bevel gears (a = 0, Section 6.1) and hypoid designs without a pronounced split (Sample 3, Section 6.3, matches to 0.06%) are unaffected - this is specifically a failure mode of strongly asymmetric hypoid geometry, not of the Clb formula or the hypoid code path in general.</w:t>
+        <w:t xml:space="preserve">The load sharing factors ZLS (Part 2) and YLS = ZLS^2 (Part 3) carry a known high bias (roughly 3-10%, scaling with how pronounced the split is) for hypoid designs with a marked asymmetry between fmaxB and |fmax0| (Section 3.6, Section 6.2, Section 6.4 - two of the three hypoid samples, 2 and 4, hit this); the calculator raises an on-screen warning when this condition is detected. Non-offset bevel gears (a = 0, Section 6.1) and hypoid designs without a pronounced split (Sample 3, Section 6.3, matches to 0.06%) are unaffected - this is specifically a failure mode of strongly asymmetric hypoid geometry, not of the Clb formula or the hypoid code path in general.</w:t>
       </w:r>
     </w:p>
     <w:p>
@@ -5953,7 +6933,7 @@
         <w:spacing w:after="80"/>
       </w:pPr>
       <w:r>
-        <w:t xml:space="preserve">Non-generated (form-cut) gears are not supported for the tooth form factor YFa - only generated gears (6.4.1.2), matching AGMA2003D19Calc's own Annex C(M) scope (generated gears only).</w:t>
+        <w:t xml:space="preserve">Non-generated (form-cut) gears are supported for the WHEEL only (6.4.1.3, Eq 18-23, Section 3.11, validated against Sample 4), selected via the WheelIsNonGenerated input; the pinion is always assumed generated (6.4.1.2), matching the standard's own text ("the mating pinion, which is manufactured by an adapted generating process") and AGMA2003D19Calc's identical generated-pinion assumption.</w:t>
       </w:r>
     </w:p>
     <w:p>
@@ -6122,7 +7102,7 @@
         <w:spacing w:after="80"/>
       </w:pPr>
       <w:r>
-        <w:t xml:space="preserve">Use the "Load Example" dropdown to choose ISO/TR 10300-30:2024 Sample 1 (bevel, no offset), Sample 2 (hypoid, a = 15 mm) or Sample 3 (hypoid, a = 31.75 mm) (Section 6), then click "Load Example" and "Calculate" to reproduce the published results.</w:t>
+        <w:t xml:space="preserve">Use the "Load Example" dropdown to choose ISO/TR 10300-30:2024 Sample 1 (bevel, no offset), Sample 2 (hypoid, a = 15 mm), Sample 3 (hypoid, a = 31.75 mm) or Sample 4 (hypoid, non-generated wheel) (Section 6), then click "Load Example" and "Calculate" to reproduce the published results.</w:t>
       </w:r>
     </w:p>
     <w:p>
@@ -6135,7 +7115,7 @@
         <w:spacing w:after="80"/>
       </w:pPr>
       <w:r>
-        <w:t xml:space="preserve">Run with the --selftest command-line argument to reproduce all three validations in Section 6 and print a pass/fail report to the console.</w:t>
+        <w:t xml:space="preserve">Run with the --selftest command-line argument to reproduce all four validations in Section 6 and print a pass/fail report to the console.</w:t>
       </w:r>
     </w:p>
     <w:p>
@@ -6636,7 +7616,7 @@
                 <w:sz w:val="20"/>
                 <w:szCs w:val="20"/>
               </w:rPr>
-              <w:t xml:space="preserve">--selftest harness (ISO/TR 10300-30 Sample 1, 2 and 3 validation)</w:t>
+              <w:t xml:space="preserve">--selftest harness (ISO/TR 10300-30 Sample 1, 2, 3 and 4 validation)</w:t>
             </w:r>
           </w:p>
         </w:tc>
@@ -6682,7 +7662,7 @@
                 <w:sz w:val="20"/>
                 <w:szCs w:val="20"/>
               </w:rPr>
-              <w:t xml:space="preserve">PropertyGrid + report UI, two loadable examples</w:t>
+              <w:t xml:space="preserve">PropertyGrid + report UI, four loadable examples</w:t>
             </w:r>
           </w:p>
         </w:tc>

</xml_diff>

<commit_message>
Document KISSsoft cross-check in ISO 10300 findings
Adds Section 6.5 to the findings docx: an independent third-party
validation (KISSsoft, same Sample 1 gearset) showing every quantity
except the life factor matches to within a few tenths of a percent.
Pins down the ZNT/YNT divergence to KISSsoft's "optimum quality"
material curve, which this tool's simplified single-curve-per-family
model doesn't implement, and sharpens the related Section 7 bullet.

Co-Authored-By: Claude Sonnet 5 <noreply@anthropic.com>
</commit_message>
<xml_diff>
--- a/ISO10300Calc/ISO10300_Implementation_Findings.docx
+++ b/ISO10300Calc/ISO10300_Implementation_Findings.docx
@@ -6864,6 +6864,1157 @@
     </w:p>
     <w:p>
       <w:pPr>
+        <w:pStyle w:val="Heading2"/>
+        <w:spacing w:after="120" w:before="240"/>
+      </w:pPr>
+      <w:r>
+        <w:t xml:space="preserve">6.5 Independent cross-check: KISSsoft</w:t>
+      </w:r>
+    </w:p>
+    <w:p>
+      <w:pPr>
+        <w:spacing w:after="160"/>
+      </w:pPr>
+      <w:r>
+        <w:t xml:space="preserve">As a cross-check independent of ISO/TR 10300-30 itself, this calculator was run against a KISSsoft report ("S01 Bevel (ISO 10300 Sample 1 FM) - Bevel gear pair", KISSsoft Release 2026-SP1, Method B1) for a gear KISSsoft's own input data confirms is the identical Sample 1 gearset - same z1/z2, pressure/spiral angles, mean pitch diameters, addenda/dedenda, profile shift coefficients, T1 = 300 Nm, n1 = 1200 rpm, KA = 1.10, mounting condition and sigmaHlim/sigmaFlim, to the last published digit. The one input KISSsoft's report states that this project's own Sample 1 self-test does not (Section 6.1.2) is an explicit required service life (H = 20 000 h), which at n1 = 1200 rpm / n2 = 430.77 rpm gives NL1 = 1.440*10^9 and NL2 = 5.169*10^8 load cycles - this calculator was re-run with those exact cycle counts for a true apples-to-apples comparison, rather than relying on published Sample 1 numbers computed at a different, unstated life.</w:t>
+      </w:r>
+    </w:p>
+    <w:tbl>
+      <w:tblPr>
+        <w:tblW w:type="dxa" w:w="9200"/>
+        <w:tblBorders>
+          <w:top w:val="single" w:color="auto" w:sz="4"/>
+          <w:left w:val="single" w:color="auto" w:sz="4"/>
+          <w:bottom w:val="single" w:color="auto" w:sz="4"/>
+          <w:right w:val="single" w:color="auto" w:sz="4"/>
+          <w:insideH w:val="single" w:color="auto" w:sz="4"/>
+          <w:insideV w:val="single" w:color="auto" w:sz="4"/>
+        </w:tblBorders>
+      </w:tblPr>
+      <w:tblGrid>
+        <w:gridCol w:w="3400"/>
+        <w:gridCol w:w="2200"/>
+        <w:gridCol w:w="2200"/>
+        <w:gridCol w:w="1400"/>
+      </w:tblGrid>
+      <w:tr>
+        <w:trPr>
+          <w:tblHeader/>
+        </w:trPr>
+        <w:tc>
+          <w:tcPr>
+            <w:tcW w:type="dxa" w:w="3400"/>
+            <w:shd w:fill="D9E2F3" w:val="clear"/>
+            <w:tcMar>
+              <w:top w:type="dxa" w:w="60"/>
+              <w:left w:type="dxa" w:w="100"/>
+              <w:bottom w:type="dxa" w:w="60"/>
+              <w:right w:type="dxa" w:w="100"/>
+            </w:tcMar>
+          </w:tcPr>
+          <w:p>
+            <w:r>
+              <w:rPr>
+                <w:b/>
+                <w:bCs/>
+                <w:sz w:val="20"/>
+                <w:szCs w:val="20"/>
+              </w:rPr>
+              <w:t xml:space="preserve">Quantity</w:t>
+            </w:r>
+          </w:p>
+        </w:tc>
+        <w:tc>
+          <w:tcPr>
+            <w:tcW w:type="dxa" w:w="2200"/>
+            <w:shd w:fill="D9E2F3" w:val="clear"/>
+            <w:tcMar>
+              <w:top w:type="dxa" w:w="60"/>
+              <w:left w:type="dxa" w:w="100"/>
+              <w:bottom w:type="dxa" w:w="60"/>
+              <w:right w:type="dxa" w:w="100"/>
+            </w:tcMar>
+          </w:tcPr>
+          <w:p>
+            <w:r>
+              <w:rPr>
+                <w:b/>
+                <w:bCs/>
+                <w:sz w:val="20"/>
+                <w:szCs w:val="20"/>
+              </w:rPr>
+              <w:t xml:space="preserve">This calculator</w:t>
+            </w:r>
+          </w:p>
+        </w:tc>
+        <w:tc>
+          <w:tcPr>
+            <w:tcW w:type="dxa" w:w="2200"/>
+            <w:shd w:fill="D9E2F3" w:val="clear"/>
+            <w:tcMar>
+              <w:top w:type="dxa" w:w="60"/>
+              <w:left w:type="dxa" w:w="100"/>
+              <w:bottom w:type="dxa" w:w="60"/>
+              <w:right w:type="dxa" w:w="100"/>
+            </w:tcMar>
+          </w:tcPr>
+          <w:p>
+            <w:r>
+              <w:rPr>
+                <w:b/>
+                <w:bCs/>
+                <w:sz w:val="20"/>
+                <w:szCs w:val="20"/>
+              </w:rPr>
+              <w:t xml:space="preserve">KISSsoft</w:t>
+            </w:r>
+          </w:p>
+        </w:tc>
+        <w:tc>
+          <w:tcPr>
+            <w:tcW w:type="dxa" w:w="1400"/>
+            <w:shd w:fill="D9E2F3" w:val="clear"/>
+            <w:tcMar>
+              <w:top w:type="dxa" w:w="60"/>
+              <w:left w:type="dxa" w:w="100"/>
+              <w:bottom w:type="dxa" w:w="60"/>
+              <w:right w:type="dxa" w:w="100"/>
+            </w:tcMar>
+          </w:tcPr>
+          <w:p>
+            <w:r>
+              <w:rPr>
+                <w:b/>
+                <w:bCs/>
+                <w:sz w:val="20"/>
+                <w:szCs w:val="20"/>
+              </w:rPr>
+              <w:t xml:space="preserve">Diff.</w:t>
+            </w:r>
+          </w:p>
+        </w:tc>
+      </w:tr>
+      <w:tr>
+        <w:tc>
+          <w:tcPr>
+            <w:tcW w:type="dxa" w:w="3400"/>
+            <w:tcMar>
+              <w:top w:type="dxa" w:w="60"/>
+              <w:left w:type="dxa" w:w="100"/>
+              <w:bottom w:type="dxa" w:w="60"/>
+              <w:right w:type="dxa" w:w="100"/>
+            </w:tcMar>
+          </w:tcPr>
+          <w:p>
+            <w:r>
+              <w:rPr>
+                <w:b w:val="false"/>
+                <w:bCs w:val="false"/>
+                <w:sz w:val="20"/>
+                <w:szCs w:val="20"/>
+              </w:rPr>
+              <w:t xml:space="preserve">ZM-B, ZLS, ZE</w:t>
+            </w:r>
+          </w:p>
+        </w:tc>
+        <w:tc>
+          <w:tcPr>
+            <w:tcW w:type="dxa" w:w="2200"/>
+            <w:tcMar>
+              <w:top w:type="dxa" w:w="60"/>
+              <w:left w:type="dxa" w:w="100"/>
+              <w:bottom w:type="dxa" w:w="60"/>
+              <w:right w:type="dxa" w:w="100"/>
+            </w:tcMar>
+          </w:tcPr>
+          <w:p>
+            <w:r>
+              <w:rPr>
+                <w:b w:val="false"/>
+                <w:bCs w:val="false"/>
+                <w:sz w:val="20"/>
+                <w:szCs w:val="20"/>
+              </w:rPr>
+              <w:t xml:space="preserve">0.916 / 0.934 / 191.65</w:t>
+            </w:r>
+          </w:p>
+        </w:tc>
+        <w:tc>
+          <w:tcPr>
+            <w:tcW w:type="dxa" w:w="2200"/>
+            <w:tcMar>
+              <w:top w:type="dxa" w:w="60"/>
+              <w:left w:type="dxa" w:w="100"/>
+              <w:bottom w:type="dxa" w:w="60"/>
+              <w:right w:type="dxa" w:w="100"/>
+            </w:tcMar>
+          </w:tcPr>
+          <w:p>
+            <w:r>
+              <w:rPr>
+                <w:b w:val="false"/>
+                <w:bCs w:val="false"/>
+                <w:sz w:val="20"/>
+                <w:szCs w:val="20"/>
+              </w:rPr>
+              <w:t xml:space="preserve">0.916 / 0.935 / 191.65</w:t>
+            </w:r>
+          </w:p>
+        </w:tc>
+        <w:tc>
+          <w:tcPr>
+            <w:tcW w:type="dxa" w:w="1400"/>
+            <w:tcMar>
+              <w:top w:type="dxa" w:w="60"/>
+              <w:left w:type="dxa" w:w="100"/>
+              <w:bottom w:type="dxa" w:w="60"/>
+              <w:right w:type="dxa" w:w="100"/>
+            </w:tcMar>
+          </w:tcPr>
+          <w:p>
+            <w:r>
+              <w:rPr>
+                <w:b w:val="false"/>
+                <w:bCs w:val="false"/>
+                <w:sz w:val="20"/>
+                <w:szCs w:val="20"/>
+              </w:rPr>
+              <w:t xml:space="preserve">&lt;0.1%</w:t>
+            </w:r>
+          </w:p>
+        </w:tc>
+      </w:tr>
+      <w:tr>
+        <w:tc>
+          <w:tcPr>
+            <w:tcW w:type="dxa" w:w="3400"/>
+            <w:tcMar>
+              <w:top w:type="dxa" w:w="60"/>
+              <w:left w:type="dxa" w:w="100"/>
+              <w:bottom w:type="dxa" w:w="60"/>
+              <w:right w:type="dxa" w:w="100"/>
+            </w:tcMar>
+          </w:tcPr>
+          <w:p>
+            <w:r>
+              <w:rPr>
+                <w:b w:val="false"/>
+                <w:bCs w:val="false"/>
+                <w:sz w:val="20"/>
+                <w:szCs w:val="20"/>
+              </w:rPr>
+              <w:t xml:space="preserve">Kv (Method B)</w:t>
+            </w:r>
+          </w:p>
+        </w:tc>
+        <w:tc>
+          <w:tcPr>
+            <w:tcW w:type="dxa" w:w="2200"/>
+            <w:tcMar>
+              <w:top w:type="dxa" w:w="60"/>
+              <w:left w:type="dxa" w:w="100"/>
+              <w:bottom w:type="dxa" w:w="60"/>
+              <w:right w:type="dxa" w:w="100"/>
+            </w:tcMar>
+          </w:tcPr>
+          <w:p>
+            <w:r>
+              <w:rPr>
+                <w:b w:val="false"/>
+                <w:bCs w:val="false"/>
+                <w:sz w:val="20"/>
+                <w:szCs w:val="20"/>
+              </w:rPr>
+              <w:t xml:space="preserve">1.017</w:t>
+            </w:r>
+          </w:p>
+        </w:tc>
+        <w:tc>
+          <w:tcPr>
+            <w:tcW w:type="dxa" w:w="2200"/>
+            <w:tcMar>
+              <w:top w:type="dxa" w:w="60"/>
+              <w:left w:type="dxa" w:w="100"/>
+              <w:bottom w:type="dxa" w:w="60"/>
+              <w:right w:type="dxa" w:w="100"/>
+            </w:tcMar>
+          </w:tcPr>
+          <w:p>
+            <w:r>
+              <w:rPr>
+                <w:b w:val="false"/>
+                <w:bCs w:val="false"/>
+                <w:sz w:val="20"/>
+                <w:szCs w:val="20"/>
+              </w:rPr>
+              <w:t xml:space="preserve">1.02</w:t>
+            </w:r>
+          </w:p>
+        </w:tc>
+        <w:tc>
+          <w:tcPr>
+            <w:tcW w:type="dxa" w:w="1400"/>
+            <w:tcMar>
+              <w:top w:type="dxa" w:w="60"/>
+              <w:left w:type="dxa" w:w="100"/>
+              <w:bottom w:type="dxa" w:w="60"/>
+              <w:right w:type="dxa" w:w="100"/>
+            </w:tcMar>
+          </w:tcPr>
+          <w:p>
+            <w:r>
+              <w:rPr>
+                <w:b w:val="false"/>
+                <w:bCs w:val="false"/>
+                <w:sz w:val="20"/>
+                <w:szCs w:val="20"/>
+              </w:rPr>
+              <w:t xml:space="preserve">0.3%</w:t>
+            </w:r>
+          </w:p>
+        </w:tc>
+      </w:tr>
+      <w:tr>
+        <w:tc>
+          <w:tcPr>
+            <w:tcW w:type="dxa" w:w="3400"/>
+            <w:tcMar>
+              <w:top w:type="dxa" w:w="60"/>
+              <w:left w:type="dxa" w:w="100"/>
+              <w:bottom w:type="dxa" w:w="60"/>
+              <w:right w:type="dxa" w:w="100"/>
+            </w:tcMar>
+          </w:tcPr>
+          <w:p>
+            <w:r>
+              <w:rPr>
+                <w:b w:val="false"/>
+                <w:bCs w:val="false"/>
+                <w:sz w:val="20"/>
+                <w:szCs w:val="20"/>
+              </w:rPr>
+              <w:t xml:space="preserve">KHbeta-C, KHalpha (final)</w:t>
+            </w:r>
+          </w:p>
+        </w:tc>
+        <w:tc>
+          <w:tcPr>
+            <w:tcW w:type="dxa" w:w="2200"/>
+            <w:tcMar>
+              <w:top w:type="dxa" w:w="60"/>
+              <w:left w:type="dxa" w:w="100"/>
+              <w:bottom w:type="dxa" w:w="60"/>
+              <w:right w:type="dxa" w:w="100"/>
+            </w:tcMar>
+          </w:tcPr>
+          <w:p>
+            <w:r>
+              <w:rPr>
+                <w:b w:val="false"/>
+                <w:bCs w:val="false"/>
+                <w:sz w:val="20"/>
+                <w:szCs w:val="20"/>
+              </w:rPr>
+              <w:t xml:space="preserve">1.650 / 1.161</w:t>
+            </w:r>
+          </w:p>
+        </w:tc>
+        <w:tc>
+          <w:tcPr>
+            <w:tcW w:type="dxa" w:w="2200"/>
+            <w:tcMar>
+              <w:top w:type="dxa" w:w="60"/>
+              <w:left w:type="dxa" w:w="100"/>
+              <w:bottom w:type="dxa" w:w="60"/>
+              <w:right w:type="dxa" w:w="100"/>
+            </w:tcMar>
+          </w:tcPr>
+          <w:p>
+            <w:r>
+              <w:rPr>
+                <w:b w:val="false"/>
+                <w:bCs w:val="false"/>
+                <w:sz w:val="20"/>
+                <w:szCs w:val="20"/>
+              </w:rPr>
+              <w:t xml:space="preserve">1.65 / 1.16</w:t>
+            </w:r>
+          </w:p>
+        </w:tc>
+        <w:tc>
+          <w:tcPr>
+            <w:tcW w:type="dxa" w:w="1400"/>
+            <w:tcMar>
+              <w:top w:type="dxa" w:w="60"/>
+              <w:left w:type="dxa" w:w="100"/>
+              <w:bottom w:type="dxa" w:w="60"/>
+              <w:right w:type="dxa" w:w="100"/>
+            </w:tcMar>
+          </w:tcPr>
+          <w:p>
+            <w:r>
+              <w:rPr>
+                <w:b w:val="false"/>
+                <w:bCs w:val="false"/>
+                <w:sz w:val="20"/>
+                <w:szCs w:val="20"/>
+              </w:rPr>
+              <w:t xml:space="preserve">&lt;0.1%</w:t>
+            </w:r>
+          </w:p>
+        </w:tc>
+      </w:tr>
+      <w:tr>
+        <w:tc>
+          <w:tcPr>
+            <w:tcW w:type="dxa" w:w="3400"/>
+            <w:tcMar>
+              <w:top w:type="dxa" w:w="60"/>
+              <w:left w:type="dxa" w:w="100"/>
+              <w:bottom w:type="dxa" w:w="60"/>
+              <w:right w:type="dxa" w:w="100"/>
+            </w:tcMar>
+          </w:tcPr>
+          <w:p>
+            <w:r>
+              <w:rPr>
+                <w:b w:val="false"/>
+                <w:bCs w:val="false"/>
+                <w:sz w:val="20"/>
+                <w:szCs w:val="20"/>
+              </w:rPr>
+              <w:t xml:space="preserve">sigmaH0-B1, sigmaH-B1 (N/mm^2)</w:t>
+            </w:r>
+          </w:p>
+        </w:tc>
+        <w:tc>
+          <w:tcPr>
+            <w:tcW w:type="dxa" w:w="2200"/>
+            <w:tcMar>
+              <w:top w:type="dxa" w:w="60"/>
+              <w:left w:type="dxa" w:w="100"/>
+              <w:bottom w:type="dxa" w:w="60"/>
+              <w:right w:type="dxa" w:w="100"/>
+            </w:tcMar>
+          </w:tcPr>
+          <w:p>
+            <w:r>
+              <w:rPr>
+                <w:b w:val="false"/>
+                <w:bCs w:val="false"/>
+                <w:sz w:val="20"/>
+                <w:szCs w:val="20"/>
+              </w:rPr>
+              <w:t xml:space="preserve">1167.6 / 1709.8</w:t>
+            </w:r>
+          </w:p>
+        </w:tc>
+        <w:tc>
+          <w:tcPr>
+            <w:tcW w:type="dxa" w:w="2200"/>
+            <w:tcMar>
+              <w:top w:type="dxa" w:w="60"/>
+              <w:left w:type="dxa" w:w="100"/>
+              <w:bottom w:type="dxa" w:w="60"/>
+              <w:right w:type="dxa" w:w="100"/>
+            </w:tcMar>
+          </w:tcPr>
+          <w:p>
+            <w:r>
+              <w:rPr>
+                <w:b w:val="false"/>
+                <w:bCs w:val="false"/>
+                <w:sz w:val="20"/>
+                <w:szCs w:val="20"/>
+              </w:rPr>
+              <w:t xml:space="preserve">1168.5 / 1713.1</w:t>
+            </w:r>
+          </w:p>
+        </w:tc>
+        <w:tc>
+          <w:tcPr>
+            <w:tcW w:type="dxa" w:w="1400"/>
+            <w:tcMar>
+              <w:top w:type="dxa" w:w="60"/>
+              <w:left w:type="dxa" w:w="100"/>
+              <w:bottom w:type="dxa" w:w="60"/>
+              <w:right w:type="dxa" w:w="100"/>
+            </w:tcMar>
+          </w:tcPr>
+          <w:p>
+            <w:r>
+              <w:rPr>
+                <w:b w:val="false"/>
+                <w:bCs w:val="false"/>
+                <w:sz w:val="20"/>
+                <w:szCs w:val="20"/>
+              </w:rPr>
+              <w:t xml:space="preserve">&lt;0.2%</w:t>
+            </w:r>
+          </w:p>
+        </w:tc>
+      </w:tr>
+      <w:tr>
+        <w:tc>
+          <w:tcPr>
+            <w:tcW w:type="dxa" w:w="3400"/>
+            <w:tcMar>
+              <w:top w:type="dxa" w:w="60"/>
+              <w:left w:type="dxa" w:w="100"/>
+              <w:bottom w:type="dxa" w:w="60"/>
+              <w:right w:type="dxa" w:w="100"/>
+            </w:tcMar>
+          </w:tcPr>
+          <w:p>
+            <w:r>
+              <w:rPr>
+                <w:b w:val="false"/>
+                <w:bCs w:val="false"/>
+                <w:sz w:val="20"/>
+                <w:szCs w:val="20"/>
+              </w:rPr>
+              <w:t xml:space="preserve">YFa1/YSa1, YFa2/YSa2 (pinion/wheel)</w:t>
+            </w:r>
+          </w:p>
+        </w:tc>
+        <w:tc>
+          <w:tcPr>
+            <w:tcW w:type="dxa" w:w="2200"/>
+            <w:tcMar>
+              <w:top w:type="dxa" w:w="60"/>
+              <w:left w:type="dxa" w:w="100"/>
+              <w:bottom w:type="dxa" w:w="60"/>
+              <w:right w:type="dxa" w:w="100"/>
+            </w:tcMar>
+          </w:tcPr>
+          <w:p>
+            <w:r>
+              <w:rPr>
+                <w:b w:val="false"/>
+                <w:bCs w:val="false"/>
+                <w:sz w:val="20"/>
+                <w:szCs w:val="20"/>
+              </w:rPr>
+              <w:t xml:space="preserve">2.033/2.022, 2.479/1.707</w:t>
+            </w:r>
+          </w:p>
+        </w:tc>
+        <w:tc>
+          <w:tcPr>
+            <w:tcW w:type="dxa" w:w="2200"/>
+            <w:tcMar>
+              <w:top w:type="dxa" w:w="60"/>
+              <w:left w:type="dxa" w:w="100"/>
+              <w:bottom w:type="dxa" w:w="60"/>
+              <w:right w:type="dxa" w:w="100"/>
+            </w:tcMar>
+          </w:tcPr>
+          <w:p>
+            <w:r>
+              <w:rPr>
+                <w:b w:val="false"/>
+                <w:bCs w:val="false"/>
+                <w:sz w:val="20"/>
+                <w:szCs w:val="20"/>
+              </w:rPr>
+              <w:t xml:space="preserve">2.03/2.02, 2.48/1.71</w:t>
+            </w:r>
+          </w:p>
+        </w:tc>
+        <w:tc>
+          <w:tcPr>
+            <w:tcW w:type="dxa" w:w="1400"/>
+            <w:tcMar>
+              <w:top w:type="dxa" w:w="60"/>
+              <w:left w:type="dxa" w:w="100"/>
+              <w:bottom w:type="dxa" w:w="60"/>
+              <w:right w:type="dxa" w:w="100"/>
+            </w:tcMar>
+          </w:tcPr>
+          <w:p>
+            <w:r>
+              <w:rPr>
+                <w:b w:val="false"/>
+                <w:bCs w:val="false"/>
+                <w:sz w:val="20"/>
+                <w:szCs w:val="20"/>
+              </w:rPr>
+              <w:t xml:space="preserve">&lt;0.1%</w:t>
+            </w:r>
+          </w:p>
+        </w:tc>
+      </w:tr>
+      <w:tr>
+        <w:tc>
+          <w:tcPr>
+            <w:tcW w:type="dxa" w:w="3400"/>
+            <w:tcMar>
+              <w:top w:type="dxa" w:w="60"/>
+              <w:left w:type="dxa" w:w="100"/>
+              <w:bottom w:type="dxa" w:w="60"/>
+              <w:right w:type="dxa" w:w="100"/>
+            </w:tcMar>
+          </w:tcPr>
+          <w:p>
+            <w:r>
+              <w:rPr>
+                <w:b w:val="false"/>
+                <w:bCs w:val="false"/>
+                <w:sz w:val="20"/>
+                <w:szCs w:val="20"/>
+              </w:rPr>
+              <w:t xml:space="preserve">YBS</w:t>
+            </w:r>
+          </w:p>
+        </w:tc>
+        <w:tc>
+          <w:tcPr>
+            <w:tcW w:type="dxa" w:w="2200"/>
+            <w:tcMar>
+              <w:top w:type="dxa" w:w="60"/>
+              <w:left w:type="dxa" w:w="100"/>
+              <w:bottom w:type="dxa" w:w="60"/>
+              <w:right w:type="dxa" w:w="100"/>
+            </w:tcMar>
+          </w:tcPr>
+          <w:p>
+            <w:r>
+              <w:rPr>
+                <w:b w:val="false"/>
+                <w:bCs w:val="false"/>
+                <w:sz w:val="20"/>
+                <w:szCs w:val="20"/>
+              </w:rPr>
+              <w:t xml:space="preserve">1.0539</w:t>
+            </w:r>
+          </w:p>
+        </w:tc>
+        <w:tc>
+          <w:tcPr>
+            <w:tcW w:type="dxa" w:w="2200"/>
+            <w:tcMar>
+              <w:top w:type="dxa" w:w="60"/>
+              <w:left w:type="dxa" w:w="100"/>
+              <w:bottom w:type="dxa" w:w="60"/>
+              <w:right w:type="dxa" w:w="100"/>
+            </w:tcMar>
+          </w:tcPr>
+          <w:p>
+            <w:r>
+              <w:rPr>
+                <w:b w:val="false"/>
+                <w:bCs w:val="false"/>
+                <w:sz w:val="20"/>
+                <w:szCs w:val="20"/>
+              </w:rPr>
+              <w:t xml:space="preserve">1.054</w:t>
+            </w:r>
+          </w:p>
+        </w:tc>
+        <w:tc>
+          <w:tcPr>
+            <w:tcW w:type="dxa" w:w="1400"/>
+            <w:tcMar>
+              <w:top w:type="dxa" w:w="60"/>
+              <w:left w:type="dxa" w:w="100"/>
+              <w:bottom w:type="dxa" w:w="60"/>
+              <w:right w:type="dxa" w:w="100"/>
+            </w:tcMar>
+          </w:tcPr>
+          <w:p>
+            <w:r>
+              <w:rPr>
+                <w:b w:val="false"/>
+                <w:bCs w:val="false"/>
+                <w:sz w:val="20"/>
+                <w:szCs w:val="20"/>
+              </w:rPr>
+              <w:t xml:space="preserve">&lt;0.01%</w:t>
+            </w:r>
+          </w:p>
+        </w:tc>
+      </w:tr>
+      <w:tr>
+        <w:tc>
+          <w:tcPr>
+            <w:tcW w:type="dxa" w:w="3400"/>
+            <w:tcMar>
+              <w:top w:type="dxa" w:w="60"/>
+              <w:left w:type="dxa" w:w="100"/>
+              <w:bottom w:type="dxa" w:w="60"/>
+              <w:right w:type="dxa" w:w="100"/>
+            </w:tcMar>
+          </w:tcPr>
+          <w:p>
+            <w:r>
+              <w:rPr>
+                <w:b w:val="false"/>
+                <w:bCs w:val="false"/>
+                <w:sz w:val="20"/>
+                <w:szCs w:val="20"/>
+              </w:rPr>
+              <w:t xml:space="preserve">ZL, Zv, ZR</w:t>
+            </w:r>
+          </w:p>
+        </w:tc>
+        <w:tc>
+          <w:tcPr>
+            <w:tcW w:type="dxa" w:w="2200"/>
+            <w:tcMar>
+              <w:top w:type="dxa" w:w="60"/>
+              <w:left w:type="dxa" w:w="100"/>
+              <w:bottom w:type="dxa" w:w="60"/>
+              <w:right w:type="dxa" w:w="100"/>
+            </w:tcMar>
+          </w:tcPr>
+          <w:p>
+            <w:r>
+              <w:rPr>
+                <w:b w:val="false"/>
+                <w:bCs w:val="false"/>
+                <w:sz w:val="20"/>
+                <w:szCs w:val="20"/>
+              </w:rPr>
+              <w:t xml:space="preserve">0.992 / 0.974 / 0.930</w:t>
+            </w:r>
+          </w:p>
+        </w:tc>
+        <w:tc>
+          <w:tcPr>
+            <w:tcW w:type="dxa" w:w="2200"/>
+            <w:tcMar>
+              <w:top w:type="dxa" w:w="60"/>
+              <w:left w:type="dxa" w:w="100"/>
+              <w:bottom w:type="dxa" w:w="60"/>
+              <w:right w:type="dxa" w:w="100"/>
+            </w:tcMar>
+          </w:tcPr>
+          <w:p>
+            <w:r>
+              <w:rPr>
+                <w:b w:val="false"/>
+                <w:bCs w:val="false"/>
+                <w:sz w:val="20"/>
+                <w:szCs w:val="20"/>
+              </w:rPr>
+              <w:t xml:space="preserve">0.992 / 0.974 / 0.930</w:t>
+            </w:r>
+          </w:p>
+        </w:tc>
+        <w:tc>
+          <w:tcPr>
+            <w:tcW w:type="dxa" w:w="1400"/>
+            <w:tcMar>
+              <w:top w:type="dxa" w:w="60"/>
+              <w:left w:type="dxa" w:w="100"/>
+              <w:bottom w:type="dxa" w:w="60"/>
+              <w:right w:type="dxa" w:w="100"/>
+            </w:tcMar>
+          </w:tcPr>
+          <w:p>
+            <w:r>
+              <w:rPr>
+                <w:b w:val="false"/>
+                <w:bCs w:val="false"/>
+                <w:sz w:val="20"/>
+                <w:szCs w:val="20"/>
+              </w:rPr>
+              <w:t xml:space="preserve">exact</w:t>
+            </w:r>
+          </w:p>
+        </w:tc>
+      </w:tr>
+    </w:tbl>
+    <w:p>
+      <w:pPr>
+        <w:spacing w:after="160"/>
+      </w:pPr>
+      <w:r>
+        <w:t xml:space="preserve">Every quantity in that table - virtual cylindrical gear geometry, K-factors, all pitting Z-factors except ZNT, all bending Y-factors except YNT, and both the nominal and calculated stresses - matches KISSsoft's independent implementation to within a few tenths of a percent, the same order of agreement already established against ISO/TR 10300-30's own published numbers. This is a meaningful confirmation: KISSsoft is a separate, independently-developed implementation of the same standard, so close agreement here is not circular with the ISO/TR 10300-30 validation in Sections 6.1-6.4.</w:t>
+      </w:r>
+    </w:p>
+    <w:p>
+      <w:pPr>
+        <w:spacing w:after="160"/>
+      </w:pPr>
+      <w:r>
+        <w:t xml:space="preserve">The life factors are the one place the two diverge sharply, and the cause is precisely identifiable rather than left as a mismatch. KISSsoft's report states under its Materials section: "Optimal quality and experience: Life factors Z_NT and Y_NT &gt;= 1" - i.e. KISSsoft is applying an upper, "optimum quality" curve variant that stays pinned at 1.0 out to (at least) 1.44*10^9 cycles for this material choice. This calculator's simplified single curve per material family (Section 7) instead keeps interpolating downward beyond its own breakpoints, giving ZNT = 0.976/1.043 and YNT = 0.886/0.905 (pinion/wheel) at these same cycle counts, against KISSsoft's flat 1.000/1.000:</w:t>
+      </w:r>
+    </w:p>
+    <w:tbl>
+      <w:tblPr>
+        <w:tblW w:type="dxa" w:w="7800"/>
+        <w:tblBorders>
+          <w:top w:val="single" w:color="auto" w:sz="4"/>
+          <w:left w:val="single" w:color="auto" w:sz="4"/>
+          <w:bottom w:val="single" w:color="auto" w:sz="4"/>
+          <w:right w:val="single" w:color="auto" w:sz="4"/>
+          <w:insideH w:val="single" w:color="auto" w:sz="4"/>
+          <w:insideV w:val="single" w:color="auto" w:sz="4"/>
+        </w:tblBorders>
+      </w:tblPr>
+      <w:tblGrid>
+        <w:gridCol w:w="3400"/>
+        <w:gridCol w:w="2200"/>
+        <w:gridCol w:w="2200"/>
+      </w:tblGrid>
+      <w:tr>
+        <w:trPr>
+          <w:tblHeader/>
+        </w:trPr>
+        <w:tc>
+          <w:tcPr>
+            <w:tcW w:type="dxa" w:w="3400"/>
+            <w:shd w:fill="D9E2F3" w:val="clear"/>
+            <w:tcMar>
+              <w:top w:type="dxa" w:w="60"/>
+              <w:left w:type="dxa" w:w="100"/>
+              <w:bottom w:type="dxa" w:w="60"/>
+              <w:right w:type="dxa" w:w="100"/>
+            </w:tcMar>
+          </w:tcPr>
+          <w:p>
+            <w:r>
+              <w:rPr>
+                <w:b/>
+                <w:bCs/>
+                <w:sz w:val="20"/>
+                <w:szCs w:val="20"/>
+              </w:rPr>
+              <w:t xml:space="preserve">Quantity</w:t>
+            </w:r>
+          </w:p>
+        </w:tc>
+        <w:tc>
+          <w:tcPr>
+            <w:tcW w:type="dxa" w:w="2200"/>
+            <w:shd w:fill="D9E2F3" w:val="clear"/>
+            <w:tcMar>
+              <w:top w:type="dxa" w:w="60"/>
+              <w:left w:type="dxa" w:w="100"/>
+              <w:bottom w:type="dxa" w:w="60"/>
+              <w:right w:type="dxa" w:w="100"/>
+            </w:tcMar>
+          </w:tcPr>
+          <w:p>
+            <w:r>
+              <w:rPr>
+                <w:b/>
+                <w:bCs/>
+                <w:sz w:val="20"/>
+                <w:szCs w:val="20"/>
+              </w:rPr>
+              <w:t xml:space="preserve">This calculator</w:t>
+            </w:r>
+          </w:p>
+        </w:tc>
+        <w:tc>
+          <w:tcPr>
+            <w:tcW w:type="dxa" w:w="2200"/>
+            <w:shd w:fill="D9E2F3" w:val="clear"/>
+            <w:tcMar>
+              <w:top w:type="dxa" w:w="60"/>
+              <w:left w:type="dxa" w:w="100"/>
+              <w:bottom w:type="dxa" w:w="60"/>
+              <w:right w:type="dxa" w:w="100"/>
+            </w:tcMar>
+          </w:tcPr>
+          <w:p>
+            <w:r>
+              <w:rPr>
+                <w:b/>
+                <w:bCs/>
+                <w:sz w:val="20"/>
+                <w:szCs w:val="20"/>
+              </w:rPr>
+              <w:t xml:space="preserve">KISSsoft</w:t>
+            </w:r>
+          </w:p>
+        </w:tc>
+      </w:tr>
+      <w:tr>
+        <w:tc>
+          <w:tcPr>
+            <w:tcW w:type="dxa" w:w="3400"/>
+            <w:tcMar>
+              <w:top w:type="dxa" w:w="60"/>
+              <w:left w:type="dxa" w:w="100"/>
+              <w:bottom w:type="dxa" w:w="60"/>
+              <w:right w:type="dxa" w:w="100"/>
+            </w:tcMar>
+          </w:tcPr>
+          <w:p>
+            <w:r>
+              <w:rPr>
+                <w:b w:val="false"/>
+                <w:bCs w:val="false"/>
+                <w:sz w:val="20"/>
+                <w:szCs w:val="20"/>
+              </w:rPr>
+              <w:t xml:space="preserve">ZNT (pinion / wheel)</w:t>
+            </w:r>
+          </w:p>
+        </w:tc>
+        <w:tc>
+          <w:tcPr>
+            <w:tcW w:type="dxa" w:w="2200"/>
+            <w:tcMar>
+              <w:top w:type="dxa" w:w="60"/>
+              <w:left w:type="dxa" w:w="100"/>
+              <w:bottom w:type="dxa" w:w="60"/>
+              <w:right w:type="dxa" w:w="100"/>
+            </w:tcMar>
+          </w:tcPr>
+          <w:p>
+            <w:r>
+              <w:rPr>
+                <w:b w:val="false"/>
+                <w:bCs w:val="false"/>
+                <w:sz w:val="20"/>
+                <w:szCs w:val="20"/>
+              </w:rPr>
+              <w:t xml:space="preserve">0.976 / 1.043</w:t>
+            </w:r>
+          </w:p>
+        </w:tc>
+        <w:tc>
+          <w:tcPr>
+            <w:tcW w:type="dxa" w:w="2200"/>
+            <w:tcMar>
+              <w:top w:type="dxa" w:w="60"/>
+              <w:left w:type="dxa" w:w="100"/>
+              <w:bottom w:type="dxa" w:w="60"/>
+              <w:right w:type="dxa" w:w="100"/>
+            </w:tcMar>
+          </w:tcPr>
+          <w:p>
+            <w:r>
+              <w:rPr>
+                <w:b w:val="false"/>
+                <w:bCs w:val="false"/>
+                <w:sz w:val="20"/>
+                <w:szCs w:val="20"/>
+              </w:rPr>
+              <w:t xml:space="preserve">1.000 / 1.000</w:t>
+            </w:r>
+          </w:p>
+        </w:tc>
+      </w:tr>
+      <w:tr>
+        <w:tc>
+          <w:tcPr>
+            <w:tcW w:type="dxa" w:w="3400"/>
+            <w:tcMar>
+              <w:top w:type="dxa" w:w="60"/>
+              <w:left w:type="dxa" w:w="100"/>
+              <w:bottom w:type="dxa" w:w="60"/>
+              <w:right w:type="dxa" w:w="100"/>
+            </w:tcMar>
+          </w:tcPr>
+          <w:p>
+            <w:r>
+              <w:rPr>
+                <w:b w:val="false"/>
+                <w:bCs w:val="false"/>
+                <w:sz w:val="20"/>
+                <w:szCs w:val="20"/>
+              </w:rPr>
+              <w:t xml:space="preserve">YNT (pinion / wheel)</w:t>
+            </w:r>
+          </w:p>
+        </w:tc>
+        <w:tc>
+          <w:tcPr>
+            <w:tcW w:type="dxa" w:w="2200"/>
+            <w:tcMar>
+              <w:top w:type="dxa" w:w="60"/>
+              <w:left w:type="dxa" w:w="100"/>
+              <w:bottom w:type="dxa" w:w="60"/>
+              <w:right w:type="dxa" w:w="100"/>
+            </w:tcMar>
+          </w:tcPr>
+          <w:p>
+            <w:r>
+              <w:rPr>
+                <w:b w:val="false"/>
+                <w:bCs w:val="false"/>
+                <w:sz w:val="20"/>
+                <w:szCs w:val="20"/>
+              </w:rPr>
+              <w:t xml:space="preserve">0.886 / 0.905</w:t>
+            </w:r>
+          </w:p>
+        </w:tc>
+        <w:tc>
+          <w:tcPr>
+            <w:tcW w:type="dxa" w:w="2200"/>
+            <w:tcMar>
+              <w:top w:type="dxa" w:w="60"/>
+              <w:left w:type="dxa" w:w="100"/>
+              <w:bottom w:type="dxa" w:w="60"/>
+              <w:right w:type="dxa" w:w="100"/>
+            </w:tcMar>
+          </w:tcPr>
+          <w:p>
+            <w:r>
+              <w:rPr>
+                <w:b w:val="false"/>
+                <w:bCs w:val="false"/>
+                <w:sz w:val="20"/>
+                <w:szCs w:val="20"/>
+              </w:rPr>
+              <w:t xml:space="preserve">1.000 / 1.000</w:t>
+            </w:r>
+          </w:p>
+        </w:tc>
+      </w:tr>
+      <w:tr>
+        <w:tc>
+          <w:tcPr>
+            <w:tcW w:type="dxa" w:w="3400"/>
+            <w:tcMar>
+              <w:top w:type="dxa" w:w="60"/>
+              <w:left w:type="dxa" w:w="100"/>
+              <w:bottom w:type="dxa" w:w="60"/>
+              <w:right w:type="dxa" w:w="100"/>
+            </w:tcMar>
+          </w:tcPr>
+          <w:p>
+            <w:r>
+              <w:rPr>
+                <w:b w:val="false"/>
+                <w:bCs w:val="false"/>
+                <w:sz w:val="20"/>
+                <w:szCs w:val="20"/>
+              </w:rPr>
+              <w:t xml:space="preserve">SH1-B1, SH2-B1</w:t>
+            </w:r>
+          </w:p>
+        </w:tc>
+        <w:tc>
+          <w:tcPr>
+            <w:tcW w:type="dxa" w:w="2200"/>
+            <w:tcMar>
+              <w:top w:type="dxa" w:w="60"/>
+              <w:left w:type="dxa" w:w="100"/>
+              <w:bottom w:type="dxa" w:w="60"/>
+              <w:right w:type="dxa" w:w="100"/>
+            </w:tcMar>
+          </w:tcPr>
+          <w:p>
+            <w:r>
+              <w:rPr>
+                <w:b w:val="false"/>
+                <w:bCs w:val="false"/>
+                <w:sz w:val="20"/>
+                <w:szCs w:val="20"/>
+              </w:rPr>
+              <w:t xml:space="preserve">0.924 / 0.987</w:t>
+            </w:r>
+          </w:p>
+        </w:tc>
+        <w:tc>
+          <w:tcPr>
+            <w:tcW w:type="dxa" w:w="2200"/>
+            <w:tcMar>
+              <w:top w:type="dxa" w:w="60"/>
+              <w:left w:type="dxa" w:w="100"/>
+              <w:bottom w:type="dxa" w:w="60"/>
+              <w:right w:type="dxa" w:w="100"/>
+            </w:tcMar>
+          </w:tcPr>
+          <w:p>
+            <w:r>
+              <w:rPr>
+                <w:b w:val="false"/>
+                <w:bCs w:val="false"/>
+                <w:sz w:val="20"/>
+                <w:szCs w:val="20"/>
+              </w:rPr>
+              <w:t xml:space="preserve">0.94 / 0.94</w:t>
+            </w:r>
+          </w:p>
+        </w:tc>
+      </w:tr>
+      <w:tr>
+        <w:tc>
+          <w:tcPr>
+            <w:tcW w:type="dxa" w:w="3400"/>
+            <w:tcMar>
+              <w:top w:type="dxa" w:w="60"/>
+              <w:left w:type="dxa" w:w="100"/>
+              <w:bottom w:type="dxa" w:w="60"/>
+              <w:right w:type="dxa" w:w="100"/>
+            </w:tcMar>
+          </w:tcPr>
+          <w:p>
+            <w:r>
+              <w:rPr>
+                <w:b w:val="false"/>
+                <w:bCs w:val="false"/>
+                <w:sz w:val="20"/>
+                <w:szCs w:val="20"/>
+              </w:rPr>
+              <w:t xml:space="preserve">SF1-B1, SF2-B1</w:t>
+            </w:r>
+          </w:p>
+        </w:tc>
+        <w:tc>
+          <w:tcPr>
+            <w:tcW w:type="dxa" w:w="2200"/>
+            <w:tcMar>
+              <w:top w:type="dxa" w:w="60"/>
+              <w:left w:type="dxa" w:w="100"/>
+              <w:bottom w:type="dxa" w:w="60"/>
+              <w:right w:type="dxa" w:w="100"/>
+            </w:tcMar>
+          </w:tcPr>
+          <w:p>
+            <w:r>
+              <w:rPr>
+                <w:b w:val="false"/>
+                <w:bCs w:val="false"/>
+                <w:sz w:val="20"/>
+                <w:szCs w:val="20"/>
+              </w:rPr>
+              <w:t xml:space="preserve">1.231 / 1.206</w:t>
+            </w:r>
+          </w:p>
+        </w:tc>
+        <w:tc>
+          <w:tcPr>
+            <w:tcW w:type="dxa" w:w="2200"/>
+            <w:tcMar>
+              <w:top w:type="dxa" w:w="60"/>
+              <w:left w:type="dxa" w:w="100"/>
+              <w:bottom w:type="dxa" w:w="60"/>
+              <w:right w:type="dxa" w:w="100"/>
+            </w:tcMar>
+          </w:tcPr>
+          <w:p>
+            <w:r>
+              <w:rPr>
+                <w:b w:val="false"/>
+                <w:bCs w:val="false"/>
+                <w:sz w:val="20"/>
+                <w:szCs w:val="20"/>
+              </w:rPr>
+              <w:t xml:space="preserve">1.38 / 1.33</w:t>
+            </w:r>
+          </w:p>
+        </w:tc>
+      </w:tr>
+    </w:tbl>
+    <w:p>
+      <w:pPr>
+        <w:spacing w:after="160"/>
+      </w:pPr>
+      <w:r>
+        <w:t xml:space="preserve">This both confirms and sharpens the life-factor limitation already noted from the ISO/TR 10300-30 comparison (Section 6.1.2): the gap is not merely that this tool's ZNT/YNT curves lack the standard's full material-family granularity, but specifically that they lack the standard's quality-dependent curve variants (ISO 10300-2 Table 6 / ISO 10300-3 Table 5 each define separate normal/high/optimum-quality curves per material family, not modeled here - only one representative curve per family is implemented). Notably, KISSsoft's permissible contact stress of 1617.80 N/mm^2 (identical for both gears, since its ZNT = 1.0 for both) matches ISO/TR 10300-30 Sample 1's own published sigmaHP1-B1 = 1617.8 N/mm^2 exactly (Section 6.1.2) - independent evidence that both the technical report's own Sample 1 and KISSsoft's default material-quality setting assume this same "optimum quality" curve, which is the variant this calculator does not yet implement.</w:t>
+      </w:r>
+    </w:p>
+    <w:p>
+      <w:pPr>
         <w:pStyle w:val="Heading1"/>
         <w:spacing w:after="150" w:before="300"/>
       </w:pPr>
@@ -6959,7 +8110,7 @@
         <w:spacing w:after="80"/>
       </w:pPr>
       <w:r>
-        <w:t xml:space="preserve">The life-factor curves (ZNT, Part 2 Table 6; YNT, Part 3 Table 5) are modeled with a simplified two-family log-log interpolation (case/through-hardened steel vs. nitrided steel/cast iron) rather than the standard's full four-material-family breakdown; see Section 6.2 for the resulting, well-understood divergence in permissible-stress figures at a given life.</w:t>
+        <w:t xml:space="preserve">The life-factor curves (ZNT, Part 2 Table 6; YNT, Part 3 Table 5) are modeled with a simplified two-family log-log interpolation (case/through-hardened steel vs. nitrided steel/cast iron) rather than the standard's full breakdown, which additionally defines separate normal/high/optimum-quality curve variants within each material family. This calculator implements only one representative ("normal quality") curve per family, so it does not reproduce a design run at "optimum quality" - confirmed directly by the KISSsoft cross-check (Section 6.5), where KISSsoft's own optimum-quality setting keeps ZNT/YNT pinned at 1.0 out to load cycles where this tool's curve has already interpolated down to 0.88-1.04, moving the final safety factors by 10-15%. See Section 6.2 for the analogous, ISO/TR-10300-30-only divergence at Samples 1-2's own (lower, unstated-quality) reference life.</w:t>
       </w:r>
     </w:p>
     <w:p>

</xml_diff>